<commit_message>
Senior Semester 1 update
</commit_message>
<xml_diff>
--- a/files/Sam Alawadhi Accounting Resume.docx
+++ b/files/Sam Alawadhi Accounting Resume.docx
@@ -1,6 +1,6 @@
 
 <file path=word/document.xml><?xml version="1.0" encoding="utf-8"?>
-<w:document xmlns:wpc="http://schemas.microsoft.com/office/word/2010/wordprocessingCanvas" xmlns:cx="http://schemas.microsoft.com/office/drawing/2014/chartex" xmlns:cx1="http://schemas.microsoft.com/office/drawing/2015/9/8/chartex" xmlns:cx2="http://schemas.microsoft.com/office/drawing/2015/10/21/chartex" xmlns:cx3="http://schemas.microsoft.com/office/drawing/2016/5/9/chartex" xmlns:cx4="http://schemas.microsoft.com/office/drawing/2016/5/10/chartex" xmlns:cx5="http://schemas.microsoft.com/office/drawing/2016/5/11/chartex" xmlns:cx6="http://schemas.microsoft.com/office/drawing/2016/5/12/chartex" xmlns:cx7="http://schemas.microsoft.com/office/drawing/2016/5/13/chartex" xmlns:cx8="http://schemas.microsoft.com/office/drawing/2016/5/14/chartex" xmlns:mc="http://schemas.openxmlformats.org/markup-compatibility/2006" xmlns:aink="http://schemas.microsoft.com/office/drawing/2016/ink" xmlns:am3d="http://schemas.microsoft.com/office/drawing/2017/model3d" xmlns:o="urn:schemas-microsoft-com:office:office" xmlns:oel="http://schemas.microsoft.com/office/2019/extlst" xmlns:r="http://schemas.openxmlformats.org/officeDocument/2006/relationships" xmlns:m="http://schemas.openxmlformats.org/officeDocument/2006/math" xmlns:v="urn:schemas-microsoft-com:vml" xmlns:wp14="http://schemas.microsoft.com/office/word/2010/wordprocessingDrawing" xmlns:wp="http://schemas.openxmlformats.org/drawingml/2006/wordprocessingDrawing" xmlns:w10="urn:schemas-microsoft-com:office:word" xmlns:w="http://schemas.openxmlformats.org/wordprocessingml/2006/main" xmlns:w14="http://schemas.microsoft.com/office/word/2010/wordml" xmlns:w15="http://schemas.microsoft.com/office/word/2012/wordml" xmlns:w16cex="http://schemas.microsoft.com/office/word/2018/wordml/cex" xmlns:w16cid="http://schemas.microsoft.com/office/word/2016/wordml/cid" xmlns:w16="http://schemas.microsoft.com/office/word/2018/wordml" xmlns:w16du="http://schemas.microsoft.com/office/word/2023/wordml/word16du" xmlns:w16sdtdh="http://schemas.microsoft.com/office/word/2020/wordml/sdtdatahash" xmlns:w16sdtfl="http://schemas.microsoft.com/office/word/2024/wordml/sdtformatlock" xmlns:w16se="http://schemas.microsoft.com/office/word/2015/wordml/symex" xmlns:wpg="http://schemas.microsoft.com/office/word/2010/wordprocessingGroup" xmlns:wpi="http://schemas.microsoft.com/office/word/2010/wordprocessingInk" xmlns:wne="http://schemas.microsoft.com/office/word/2006/wordml" xmlns:wps="http://schemas.microsoft.com/office/word/2010/wordprocessingShape" mc:Ignorable="w14 w15 w16se w16cid w16 w16cex w16sdtdh w16sdtfl w16du wp14">
+<w:document xmlns:wpc="http://schemas.microsoft.com/office/word/2010/wordprocessingCanvas" xmlns:cx="http://schemas.microsoft.com/office/drawing/2014/chartex" xmlns:cx1="http://schemas.microsoft.com/office/drawing/2015/9/8/chartex" xmlns:cx2="http://schemas.microsoft.com/office/drawing/2015/10/21/chartex" xmlns:cx3="http://schemas.microsoft.com/office/drawing/2016/5/9/chartex" xmlns:cx4="http://schemas.microsoft.com/office/drawing/2016/5/10/chartex" xmlns:cx5="http://schemas.microsoft.com/office/drawing/2016/5/11/chartex" xmlns:cx6="http://schemas.microsoft.com/office/drawing/2016/5/12/chartex" xmlns:cx7="http://schemas.microsoft.com/office/drawing/2016/5/13/chartex" xmlns:cx8="http://schemas.microsoft.com/office/drawing/2016/5/14/chartex" xmlns:mc="http://schemas.openxmlformats.org/markup-compatibility/2006" xmlns:m="http://schemas.openxmlformats.org/officeDocument/2006/math" xmlns:aink="http://schemas.microsoft.com/office/drawing/2016/ink" xmlns:am3d="http://schemas.microsoft.com/office/drawing/2017/model3d" xmlns:oel="http://schemas.microsoft.com/office/2019/extlst" xmlns:r="http://schemas.openxmlformats.org/officeDocument/2006/relationships" xmlns:wp14="http://schemas.microsoft.com/office/word/2010/wordprocessingDrawing" xmlns:wp="http://schemas.openxmlformats.org/drawingml/2006/wordprocessingDrawing" xmlns:wpg="http://schemas.microsoft.com/office/word/2010/wordprocessingGroup" xmlns:wpi="http://schemas.microsoft.com/office/word/2010/wordprocessingInk" xmlns:wps="http://schemas.microsoft.com/office/word/2010/wordprocessingShape" xmlns:o="urn:schemas-microsoft-com:office:office" xmlns:v="urn:schemas-microsoft-com:vml" xmlns:w10="urn:schemas-microsoft-com:office:word" xmlns:w="http://schemas.openxmlformats.org/wordprocessingml/2006/main" xmlns:w14="http://schemas.microsoft.com/office/word/2010/wordml" xmlns:w15="http://schemas.microsoft.com/office/word/2012/wordml" xmlns:w16cex="http://schemas.microsoft.com/office/word/2018/wordml/cex" xmlns:w16cid="http://schemas.microsoft.com/office/word/2016/wordml/cid" xmlns:w16="http://schemas.microsoft.com/office/word/2018/wordml" xmlns:w16sdtdh="http://schemas.microsoft.com/office/word/2020/wordml/sdtdatahash" xmlns:w16sdtfl="http://schemas.microsoft.com/office/word/2024/wordml/sdtformatlock" xmlns:w16se="http://schemas.microsoft.com/office/word/2015/wordml/symex" xmlns:w16du="http://schemas.microsoft.com/office/word/2023/wordml/word16du" xmlns:wne="http://schemas.microsoft.com/office/word/2006/wordml" mc:Ignorable="w14 w15 w16se w16cid w16 w16cex w16sdtdh w16sdtfl w16du wp14">
   <w:body>
     <w:p>
       <w:pPr>
@@ -89,7 +89,7 @@
             <w:szCs w:val="20"/>
             <w14:ligatures w14:val="none"/>
           </w:rPr>
-          <w:t>samhalawadhi@gmail.com</w:t>
+          <w:t>salawa@pointpark.edu</w:t>
         </w:r>
       </w:hyperlink>
       <w:r>
@@ -116,6 +116,28 @@
           <w:t>www.linkedin.com/in/sam-alawadhi</w:t>
         </w:r>
       </w:hyperlink>
+      <w:r>
+        <w:t xml:space="preserve"> | </w:t>
+      </w:r>
+      <w:hyperlink r:id="rId7" w:history="1">
+        <w:r>
+          <w:rPr>
+            <w:rStyle w:val="Hyperlink"/>
+            <w:rFonts w:asciiTheme="majorBidi" w:hAnsiTheme="majorBidi" w:cstheme="majorBidi"/>
+            <w:sz w:val="21"/>
+            <w:szCs w:val="21"/>
+          </w:rPr>
+          <w:t>https://samalawadhi.netlify.app/</w:t>
+        </w:r>
+      </w:hyperlink>
+      <w:r>
+        <w:rPr>
+          <w:rFonts w:asciiTheme="majorBidi" w:hAnsiTheme="majorBidi" w:cstheme="majorBidi"/>
+          <w:sz w:val="21"/>
+          <w:szCs w:val="21"/>
+        </w:rPr>
+        <w:t xml:space="preserve"> </w:t>
+      </w:r>
     </w:p>
     <w:p>
       <w:pPr>
@@ -188,7 +210,31 @@
           <w:szCs w:val="20"/>
           <w14:ligatures w14:val="none"/>
         </w:rPr>
-        <w:t>Diligent and detail-oriented student with a strong background in technology and customer service. Possesses excellent communication skills, demonstrating dependability and a proactive approach to problem-solving. Brings openness to learning and expanding knowledge on programming languages and accounting principles. Showcases leadership capabilities through previous managerial experience.</w:t>
+        <w:t>Diligent and detail-oriented student with a strong background in technology and customer service. Possesses excellent communication skills, demonstrating dependability and a proactive approach to problem-solving. Brings openness to learning and expanding knowledge on programming languages and accounting principles. Showcases leadership capabilities through previous managerial</w:t>
+      </w:r>
+      <w:r>
+        <w:rPr>
+          <w:rFonts w:ascii="Times New Roman" w:eastAsia="Calibri Light" w:hAnsi="Times New Roman" w:cs="Times New Roman"/>
+          <w:bCs/>
+          <w:color w:val="000000"/>
+          <w:kern w:val="0"/>
+          <w:sz w:val="20"/>
+          <w:szCs w:val="20"/>
+          <w14:ligatures w14:val="none"/>
+        </w:rPr>
+        <w:t>/mentorship</w:t>
+      </w:r>
+      <w:r>
+        <w:rPr>
+          <w:rFonts w:ascii="Times New Roman" w:eastAsia="Calibri Light" w:hAnsi="Times New Roman" w:cs="Times New Roman"/>
+          <w:bCs/>
+          <w:color w:val="000000"/>
+          <w:kern w:val="0"/>
+          <w:sz w:val="20"/>
+          <w:szCs w:val="20"/>
+          <w14:ligatures w14:val="none"/>
+        </w:rPr>
+        <w:t xml:space="preserve"> experience.</w:t>
       </w:r>
     </w:p>
     <w:p>
@@ -443,7 +489,17 @@
           <w14:ligatures w14:val="none"/>
         </w:rPr>
         <w:tab/>
-        <w:t>GPA 4.0</w:t>
+        <w:t xml:space="preserve">GPA </w:t>
+      </w:r>
+      <w:r>
+        <w:rPr>
+          <w:rFonts w:ascii="Times New Roman" w:eastAsia="Calibri Light" w:hAnsi="Times New Roman" w:cs="Times New Roman"/>
+          <w:kern w:val="0"/>
+          <w:sz w:val="20"/>
+          <w:szCs w:val="20"/>
+          <w14:ligatures w14:val="none"/>
+        </w:rPr>
+        <w:t>3.9</w:t>
       </w:r>
     </w:p>
     <w:p>
@@ -469,7 +525,57 @@
           <w:szCs w:val="20"/>
           <w14:ligatures w14:val="none"/>
         </w:rPr>
-        <w:t>Relevant coursework: Intermediate Financial Accounting I/II, Managerial Accounting, Accounting Information Systems</w:t>
+        <w:t xml:space="preserve">Relevant coursework: </w:t>
+      </w:r>
+      <w:r>
+        <w:rPr>
+          <w:rFonts w:ascii="Times New Roman" w:eastAsia="Calibri Light" w:hAnsi="Times New Roman" w:cs="Times New Roman"/>
+          <w:kern w:val="0"/>
+          <w:sz w:val="20"/>
+          <w:szCs w:val="20"/>
+          <w14:ligatures w14:val="none"/>
+        </w:rPr>
+        <w:t>Advanced Accounting Theory</w:t>
+      </w:r>
+      <w:r>
+        <w:rPr>
+          <w:rFonts w:ascii="Times New Roman" w:eastAsia="Calibri Light" w:hAnsi="Times New Roman" w:cs="Times New Roman"/>
+          <w:kern w:val="0"/>
+          <w:sz w:val="20"/>
+          <w:szCs w:val="20"/>
+          <w14:ligatures w14:val="none"/>
+        </w:rPr>
+        <w:t xml:space="preserve">, </w:t>
+      </w:r>
+      <w:r>
+        <w:rPr>
+          <w:rFonts w:ascii="Times New Roman" w:eastAsia="Calibri Light" w:hAnsi="Times New Roman" w:cs="Times New Roman"/>
+          <w:kern w:val="0"/>
+          <w:sz w:val="20"/>
+          <w:szCs w:val="20"/>
+          <w14:ligatures w14:val="none"/>
+        </w:rPr>
+        <w:t>Federal Taxation I/II</w:t>
+      </w:r>
+      <w:r>
+        <w:rPr>
+          <w:rFonts w:ascii="Times New Roman" w:eastAsia="Calibri Light" w:hAnsi="Times New Roman" w:cs="Times New Roman"/>
+          <w:kern w:val="0"/>
+          <w:sz w:val="20"/>
+          <w:szCs w:val="20"/>
+          <w14:ligatures w14:val="none"/>
+        </w:rPr>
+        <w:t>, Accounting Information Systems</w:t>
+      </w:r>
+      <w:r>
+        <w:rPr>
+          <w:rFonts w:ascii="Times New Roman" w:eastAsia="Calibri Light" w:hAnsi="Times New Roman" w:cs="Times New Roman"/>
+          <w:kern w:val="0"/>
+          <w:sz w:val="20"/>
+          <w:szCs w:val="20"/>
+          <w14:ligatures w14:val="none"/>
+        </w:rPr>
+        <w:t>, Auditing</w:t>
       </w:r>
     </w:p>
     <w:p>
@@ -519,109 +625,143 @@
     </w:p>
     <w:p>
       <w:pPr>
-        <w:widowControl w:val="0"/>
         <w:tabs>
-          <w:tab w:val="left" w:pos="9000"/>
+          <w:tab w:val="left" w:pos="9180"/>
+          <w:tab w:val="left" w:pos="9270"/>
         </w:tabs>
-        <w:autoSpaceDE w:val="0"/>
-        <w:autoSpaceDN w:val="0"/>
         <w:spacing w:line="276" w:lineRule="auto"/>
         <w:ind w:left="270" w:hanging="270"/>
         <w:rPr>
-          <w:rFonts w:ascii="Times New Roman" w:eastAsia="Calibri Light" w:hAnsi="Times New Roman" w:cs="Times New Roman"/>
+          <w:rFonts w:ascii="Times New Roman" w:hAnsi="Times New Roman" w:cs="Times New Roman"/>
           <w:i/>
-          <w:kern w:val="0"/>
-          <w:sz w:val="20"/>
-          <w:szCs w:val="20"/>
-          <w:lang w:val="en"/>
-          <w14:ligatures w14:val="none"/>
-        </w:rPr>
-      </w:pPr>
-      <w:r>
-        <w:rPr>
-          <w:rFonts w:ascii="Times New Roman" w:eastAsia="Calibri Light" w:hAnsi="Times New Roman" w:cs="Times New Roman"/>
+          <w:sz w:val="20"/>
+          <w:szCs w:val="20"/>
+          <w:lang w:val="en"/>
+        </w:rPr>
+      </w:pPr>
+      <w:r>
+        <w:rPr>
+          <w:rFonts w:ascii="Times New Roman" w:hAnsi="Times New Roman" w:cs="Times New Roman"/>
           <w:b/>
           <w:bCs/>
-          <w:kern w:val="0"/>
-          <w:sz w:val="20"/>
-          <w:szCs w:val="20"/>
-          <w:lang w:val="en"/>
-          <w14:ligatures w14:val="none"/>
-        </w:rPr>
-        <w:t xml:space="preserve">Resident </w:t>
-      </w:r>
-      <w:r>
-        <w:rPr>
-          <w:rFonts w:ascii="Times New Roman" w:eastAsia="Calibri Light" w:hAnsi="Times New Roman" w:cs="Times New Roman"/>
-          <w:b/>
-          <w:bCs/>
-          <w:kern w:val="0"/>
-          <w:sz w:val="20"/>
-          <w:szCs w:val="20"/>
-          <w:lang w:val="en"/>
-          <w14:ligatures w14:val="none"/>
-        </w:rPr>
-        <w:t>Educator</w:t>
-      </w:r>
-      <w:r>
-        <w:rPr>
-          <w:rFonts w:ascii="Times New Roman" w:eastAsia="Calibri Light" w:hAnsi="Times New Roman" w:cs="Times New Roman"/>
-          <w:kern w:val="0"/>
-          <w:sz w:val="20"/>
-          <w:szCs w:val="20"/>
-          <w14:ligatures w14:val="none"/>
+          <w:sz w:val="20"/>
+          <w:szCs w:val="20"/>
+          <w:lang w:val="en"/>
+        </w:rPr>
+        <w:t>Technology Controls Advisory Intern</w:t>
+      </w:r>
+      <w:r>
+        <w:rPr>
+          <w:rFonts w:ascii="Times New Roman" w:hAnsi="Times New Roman" w:cs="Times New Roman"/>
+          <w:sz w:val="20"/>
+          <w:szCs w:val="20"/>
         </w:rPr>
         <w:t xml:space="preserve">, </w:t>
       </w:r>
       <w:r>
         <w:rPr>
-          <w:rFonts w:ascii="Times New Roman" w:eastAsia="Calibri Light" w:hAnsi="Times New Roman" w:cs="Times New Roman"/>
+          <w:rFonts w:ascii="Times New Roman" w:hAnsi="Times New Roman" w:cs="Times New Roman"/>
           <w:i/>
           <w:iCs/>
-          <w:kern w:val="0"/>
-          <w:sz w:val="20"/>
-          <w:szCs w:val="20"/>
-          <w:lang w:val="en"/>
-          <w14:ligatures w14:val="none"/>
-        </w:rPr>
-        <w:t>Office of Student Life</w:t>
-      </w:r>
-      <w:r>
-        <w:rPr>
-          <w:rFonts w:ascii="Times New Roman" w:eastAsia="Calibri Light" w:hAnsi="Times New Roman" w:cs="Times New Roman"/>
+          <w:sz w:val="20"/>
+          <w:szCs w:val="20"/>
+        </w:rPr>
+        <w:t>Audit &amp; Assurance,</w:t>
+      </w:r>
+      <w:r>
+        <w:rPr>
+          <w:rFonts w:ascii="Times New Roman" w:hAnsi="Times New Roman" w:cs="Times New Roman"/>
+          <w:sz w:val="20"/>
+          <w:szCs w:val="20"/>
+        </w:rPr>
+        <w:t xml:space="preserve"> </w:t>
+      </w:r>
+      <w:r>
+        <w:rPr>
+          <w:rFonts w:ascii="Times New Roman" w:hAnsi="Times New Roman" w:cs="Times New Roman"/>
           <w:i/>
           <w:iCs/>
-          <w:kern w:val="0"/>
-          <w:sz w:val="20"/>
-          <w:szCs w:val="20"/>
-          <w14:ligatures w14:val="none"/>
-        </w:rPr>
-        <w:t>, Point Park University</w:t>
-      </w:r>
-      <w:r>
-        <w:rPr>
-          <w:rFonts w:ascii="Times New Roman" w:eastAsia="Calibri Light" w:hAnsi="Times New Roman" w:cs="Times New Roman"/>
-          <w:kern w:val="0"/>
-          <w:sz w:val="20"/>
-          <w:szCs w:val="20"/>
-          <w14:ligatures w14:val="none"/>
+          <w:sz w:val="20"/>
+          <w:szCs w:val="20"/>
+          <w:lang w:val="en"/>
+        </w:rPr>
+        <w:t>Deloitte</w:t>
+      </w:r>
+      <w:r>
+        <w:rPr>
+          <w:rFonts w:ascii="Times New Roman" w:hAnsi="Times New Roman" w:cs="Times New Roman"/>
+          <w:sz w:val="20"/>
+          <w:szCs w:val="20"/>
         </w:rPr>
         <w:tab/>
       </w:r>
       <w:r>
         <w:rPr>
-          <w:rFonts w:ascii="Times New Roman" w:eastAsia="Calibri Light" w:hAnsi="Times New Roman" w:cs="Times New Roman"/>
-          <w:kern w:val="0"/>
-          <w:sz w:val="20"/>
-          <w:szCs w:val="20"/>
-          <w:lang w:val="en"/>
-          <w14:ligatures w14:val="none"/>
-        </w:rPr>
-        <w:t>August 2024 - Present</w:t>
-      </w:r>
-    </w:p>
-    <w:p>
-      <w:pPr>
+          <w:rFonts w:ascii="Times New Roman" w:hAnsi="Times New Roman" w:cs="Times New Roman"/>
+          <w:sz w:val="20"/>
+          <w:szCs w:val="20"/>
+          <w:lang w:val="en"/>
+        </w:rPr>
+        <w:t>June</w:t>
+      </w:r>
+      <w:r>
+        <w:rPr>
+          <w:rFonts w:ascii="Times New Roman" w:hAnsi="Times New Roman" w:cs="Times New Roman"/>
+          <w:sz w:val="20"/>
+          <w:szCs w:val="20"/>
+          <w:lang w:val="en"/>
+        </w:rPr>
+        <w:t xml:space="preserve"> 202</w:t>
+      </w:r>
+      <w:r>
+        <w:rPr>
+          <w:rFonts w:ascii="Times New Roman" w:hAnsi="Times New Roman" w:cs="Times New Roman"/>
+          <w:sz w:val="20"/>
+          <w:szCs w:val="20"/>
+          <w:lang w:val="en"/>
+        </w:rPr>
+        <w:t>6</w:t>
+      </w:r>
+      <w:r>
+        <w:rPr>
+          <w:rFonts w:ascii="Times New Roman" w:hAnsi="Times New Roman" w:cs="Times New Roman"/>
+          <w:sz w:val="20"/>
+          <w:szCs w:val="20"/>
+          <w:lang w:val="en"/>
+        </w:rPr>
+        <w:t xml:space="preserve"> </w:t>
+      </w:r>
+      <w:r>
+        <w:rPr>
+          <w:rFonts w:ascii="Times New Roman" w:hAnsi="Times New Roman" w:cs="Times New Roman"/>
+          <w:sz w:val="20"/>
+          <w:szCs w:val="20"/>
+          <w:lang w:val="en"/>
+        </w:rPr>
+        <w:t>–</w:t>
+      </w:r>
+      <w:r>
+        <w:rPr>
+          <w:rFonts w:ascii="Times New Roman" w:hAnsi="Times New Roman" w:cs="Times New Roman"/>
+          <w:sz w:val="20"/>
+          <w:szCs w:val="20"/>
+          <w:lang w:val="en"/>
+        </w:rPr>
+        <w:t xml:space="preserve"> </w:t>
+      </w:r>
+      <w:r>
+        <w:rPr>
+          <w:rFonts w:ascii="Times New Roman" w:hAnsi="Times New Roman" w:cs="Times New Roman"/>
+          <w:sz w:val="20"/>
+          <w:szCs w:val="20"/>
+          <w:lang w:val="en"/>
+        </w:rPr>
+        <w:t>Present</w:t>
+      </w:r>
+    </w:p>
+    <w:p>
+      <w:pPr>
+        <w:pStyle w:val="ListParagraph"/>
         <w:widowControl w:val="0"/>
         <w:numPr>
           <w:ilvl w:val="0"/>
@@ -631,52 +771,26 @@
         <w:autoSpaceDN w:val="0"/>
         <w:spacing w:line="276" w:lineRule="auto"/>
         <w:ind w:left="270" w:hanging="270"/>
-        <w:contextualSpacing/>
-        <w:rPr>
-          <w:rFonts w:ascii="Times New Roman" w:eastAsia="Calibri Light" w:hAnsi="Times New Roman" w:cs="Times New Roman"/>
-          <w:kern w:val="0"/>
-          <w:sz w:val="20"/>
-          <w:szCs w:val="20"/>
-          <w:lang w:val="en"/>
-          <w14:ligatures w14:val="none"/>
-        </w:rPr>
-      </w:pPr>
-      <w:r>
-        <w:rPr>
-          <w:rFonts w:ascii="Times New Roman" w:eastAsia="Calibri Light" w:hAnsi="Times New Roman" w:cs="Times New Roman"/>
-          <w:kern w:val="0"/>
-          <w:sz w:val="20"/>
-          <w:szCs w:val="20"/>
-          <w:lang w:val="en"/>
-          <w14:ligatures w14:val="none"/>
-        </w:rPr>
-        <w:t xml:space="preserve">Host at least </w:t>
-      </w:r>
-      <w:r>
-        <w:rPr>
-          <w:rFonts w:ascii="Times New Roman" w:eastAsia="Calibri Light" w:hAnsi="Times New Roman" w:cs="Times New Roman"/>
-          <w:kern w:val="0"/>
-          <w:sz w:val="20"/>
-          <w:szCs w:val="20"/>
-          <w:lang w:val="en"/>
-          <w14:ligatures w14:val="none"/>
-        </w:rPr>
-        <w:t>two</w:t>
-      </w:r>
-      <w:r>
-        <w:rPr>
-          <w:rFonts w:ascii="Times New Roman" w:eastAsia="Calibri Light" w:hAnsi="Times New Roman" w:cs="Times New Roman"/>
-          <w:kern w:val="0"/>
-          <w:sz w:val="20"/>
-          <w:szCs w:val="20"/>
-          <w:lang w:val="en"/>
-          <w14:ligatures w14:val="none"/>
-        </w:rPr>
-        <w:t xml:space="preserve"> engaging community events per semester</w:t>
-      </w:r>
-    </w:p>
-    <w:p>
-      <w:pPr>
+        <w:rPr>
+          <w:rFonts w:ascii="Times New Roman" w:hAnsi="Times New Roman" w:cs="Times New Roman"/>
+          <w:sz w:val="20"/>
+          <w:szCs w:val="20"/>
+          <w:lang w:val="en"/>
+        </w:rPr>
+      </w:pPr>
+      <w:r>
+        <w:rPr>
+          <w:rFonts w:ascii="Times New Roman" w:hAnsi="Times New Roman" w:cs="Times New Roman"/>
+          <w:sz w:val="20"/>
+          <w:szCs w:val="20"/>
+          <w:lang w:val="en"/>
+        </w:rPr>
+        <w:t>Worked on 6 different engagements with clients in industries like technology, retail, and energy, resources, and industrials</w:t>
+      </w:r>
+    </w:p>
+    <w:p>
+      <w:pPr>
+        <w:pStyle w:val="ListParagraph"/>
         <w:widowControl w:val="0"/>
         <w:numPr>
           <w:ilvl w:val="0"/>
@@ -686,30 +800,26 @@
         <w:autoSpaceDN w:val="0"/>
         <w:spacing w:line="276" w:lineRule="auto"/>
         <w:ind w:left="270" w:hanging="270"/>
-        <w:contextualSpacing/>
-        <w:rPr>
-          <w:rFonts w:ascii="Times New Roman" w:eastAsia="Calibri Light" w:hAnsi="Times New Roman" w:cs="Times New Roman"/>
-          <w:kern w:val="0"/>
-          <w:sz w:val="20"/>
-          <w:szCs w:val="20"/>
-          <w:lang w:val="en"/>
-          <w14:ligatures w14:val="none"/>
-        </w:rPr>
-      </w:pPr>
-      <w:r>
-        <w:rPr>
-          <w:rFonts w:ascii="Times New Roman" w:eastAsia="Calibri Light" w:hAnsi="Times New Roman" w:cs="Times New Roman"/>
-          <w:kern w:val="0"/>
-          <w:sz w:val="20"/>
-          <w:szCs w:val="20"/>
-          <w:lang w:val="en"/>
-          <w14:ligatures w14:val="none"/>
-        </w:rPr>
-        <w:t>Ensure compliance with campus housing rules and policies by promptly addressing violations</w:t>
-      </w:r>
-    </w:p>
-    <w:p>
-      <w:pPr>
+        <w:rPr>
+          <w:rFonts w:ascii="Times New Roman" w:hAnsi="Times New Roman" w:cs="Times New Roman"/>
+          <w:sz w:val="20"/>
+          <w:szCs w:val="20"/>
+          <w:lang w:val="en"/>
+        </w:rPr>
+      </w:pPr>
+      <w:r>
+        <w:rPr>
+          <w:rFonts w:ascii="Times New Roman" w:hAnsi="Times New Roman" w:cs="Times New Roman"/>
+          <w:sz w:val="20"/>
+          <w:szCs w:val="20"/>
+          <w:lang w:val="en"/>
+        </w:rPr>
+        <w:t>Assisted in preparing 40+ workpapers involving testing internal technology controls</w:t>
+      </w:r>
+    </w:p>
+    <w:p>
+      <w:pPr>
+        <w:pStyle w:val="ListParagraph"/>
         <w:widowControl w:val="0"/>
         <w:numPr>
           <w:ilvl w:val="0"/>
@@ -719,299 +829,216 @@
         <w:autoSpaceDN w:val="0"/>
         <w:spacing w:line="276" w:lineRule="auto"/>
         <w:ind w:left="270" w:hanging="270"/>
-        <w:contextualSpacing/>
-        <w:rPr>
-          <w:rFonts w:ascii="Times New Roman" w:eastAsia="Calibri Light" w:hAnsi="Times New Roman" w:cs="Times New Roman"/>
-          <w:kern w:val="0"/>
-          <w:sz w:val="20"/>
-          <w:szCs w:val="20"/>
-          <w:lang w:val="en"/>
-          <w14:ligatures w14:val="none"/>
-        </w:rPr>
-      </w:pPr>
-      <w:r>
-        <w:rPr>
-          <w:rFonts w:ascii="Times New Roman" w:eastAsia="Calibri Light" w:hAnsi="Times New Roman" w:cs="Times New Roman"/>
-          <w:kern w:val="0"/>
-          <w:sz w:val="20"/>
-          <w:szCs w:val="20"/>
-          <w:lang w:val="en"/>
-          <w14:ligatures w14:val="none"/>
-        </w:rPr>
-        <w:t xml:space="preserve">Follow a specific writing model for submitting </w:t>
-      </w:r>
-      <w:r>
-        <w:rPr>
-          <w:rFonts w:ascii="Times New Roman" w:eastAsia="Calibri Light" w:hAnsi="Times New Roman" w:cs="Times New Roman"/>
-          <w:kern w:val="0"/>
-          <w:sz w:val="20"/>
-          <w:szCs w:val="20"/>
-          <w:lang w:val="en"/>
-          <w14:ligatures w14:val="none"/>
-        </w:rPr>
-        <w:t xml:space="preserve">more than five </w:t>
-      </w:r>
-      <w:r>
-        <w:rPr>
-          <w:rFonts w:ascii="Times New Roman" w:eastAsia="Calibri Light" w:hAnsi="Times New Roman" w:cs="Times New Roman"/>
-          <w:kern w:val="0"/>
-          <w:sz w:val="20"/>
-          <w:szCs w:val="20"/>
-          <w:lang w:val="en"/>
-          <w14:ligatures w14:val="none"/>
-        </w:rPr>
-        <w:t>incident reports throughout the semester</w:t>
-      </w:r>
-    </w:p>
-    <w:p>
-      <w:pPr>
-        <w:widowControl w:val="0"/>
-        <w:autoSpaceDE w:val="0"/>
-        <w:autoSpaceDN w:val="0"/>
-        <w:spacing w:line="276" w:lineRule="auto"/>
-        <w:ind w:left="270" w:hanging="270"/>
-        <w:rPr>
-          <w:rFonts w:ascii="Times New Roman" w:eastAsia="Calibri Light" w:hAnsi="Times New Roman" w:cs="Times New Roman"/>
-          <w:b/>
-          <w:bCs/>
-          <w:kern w:val="0"/>
-          <w:sz w:val="20"/>
-          <w:szCs w:val="20"/>
-          <w:lang w:val="en"/>
-          <w14:ligatures w14:val="none"/>
-        </w:rPr>
-      </w:pPr>
-    </w:p>
-    <w:p>
-      <w:pPr>
-        <w:widowControl w:val="0"/>
+        <w:rPr>
+          <w:rFonts w:ascii="Times New Roman" w:hAnsi="Times New Roman" w:cs="Times New Roman"/>
+          <w:sz w:val="20"/>
+          <w:szCs w:val="20"/>
+          <w:lang w:val="en"/>
+        </w:rPr>
+      </w:pPr>
+      <w:r>
+        <w:rPr>
+          <w:rFonts w:ascii="Times New Roman" w:hAnsi="Times New Roman" w:cs="Times New Roman"/>
+          <w:sz w:val="20"/>
+          <w:szCs w:val="20"/>
+          <w:lang w:val="en"/>
+        </w:rPr>
+        <w:t>Collaborated with different teams to complete assignments and client various SOX walkthroughs</w:t>
+      </w:r>
+    </w:p>
+    <w:p>
+      <w:pPr>
         <w:tabs>
           <w:tab w:val="left" w:pos="9000"/>
         </w:tabs>
-        <w:autoSpaceDE w:val="0"/>
-        <w:autoSpaceDN w:val="0"/>
         <w:spacing w:line="276" w:lineRule="auto"/>
         <w:ind w:left="270" w:hanging="270"/>
         <w:rPr>
-          <w:rFonts w:ascii="Times New Roman" w:eastAsia="Calibri Light" w:hAnsi="Times New Roman" w:cs="Times New Roman"/>
+          <w:rFonts w:ascii="Times New Roman" w:hAnsi="Times New Roman" w:cs="Times New Roman"/>
+          <w:b/>
+          <w:bCs/>
+          <w:sz w:val="20"/>
+          <w:szCs w:val="20"/>
+          <w:lang w:val="en"/>
+        </w:rPr>
+      </w:pPr>
+    </w:p>
+    <w:p>
+      <w:pPr>
+        <w:tabs>
+          <w:tab w:val="left" w:pos="9000"/>
+        </w:tabs>
+        <w:spacing w:line="276" w:lineRule="auto"/>
+        <w:ind w:left="270" w:hanging="270"/>
+        <w:rPr>
+          <w:rFonts w:ascii="Times New Roman" w:hAnsi="Times New Roman" w:cs="Times New Roman"/>
+          <w:i/>
+          <w:sz w:val="20"/>
+          <w:szCs w:val="20"/>
+          <w:lang w:val="en"/>
+        </w:rPr>
+      </w:pPr>
+      <w:r>
+        <w:rPr>
+          <w:rFonts w:ascii="Times New Roman" w:hAnsi="Times New Roman" w:cs="Times New Roman"/>
+          <w:b/>
+          <w:bCs/>
+          <w:sz w:val="20"/>
+          <w:szCs w:val="20"/>
+          <w:lang w:val="en"/>
+        </w:rPr>
+        <w:t>Financial Coordinator</w:t>
+      </w:r>
+      <w:r>
+        <w:rPr>
+          <w:rFonts w:ascii="Times New Roman" w:hAnsi="Times New Roman" w:cs="Times New Roman"/>
+          <w:sz w:val="20"/>
+          <w:szCs w:val="20"/>
+        </w:rPr>
+        <w:t xml:space="preserve">, </w:t>
+      </w:r>
+      <w:r>
+        <w:rPr>
+          <w:rFonts w:ascii="Times New Roman" w:hAnsi="Times New Roman" w:cs="Times New Roman"/>
           <w:i/>
           <w:iCs/>
-          <w:kern w:val="0"/>
-          <w:sz w:val="20"/>
-          <w:szCs w:val="20"/>
-          <w:lang w:val="en"/>
-          <w14:ligatures w14:val="none"/>
-        </w:rPr>
-      </w:pPr>
-      <w:r>
-        <w:rPr>
-          <w:rFonts w:ascii="Times New Roman" w:eastAsia="Calibri Light" w:hAnsi="Times New Roman" w:cs="Times New Roman"/>
-          <w:b/>
-          <w:bCs/>
-          <w:kern w:val="0"/>
-          <w:sz w:val="20"/>
-          <w:szCs w:val="20"/>
-          <w:lang w:val="en"/>
-          <w14:ligatures w14:val="none"/>
-        </w:rPr>
-        <w:t>Server &amp; Manager</w:t>
-      </w:r>
-      <w:r>
-        <w:rPr>
-          <w:rFonts w:ascii="Times New Roman" w:eastAsia="Calibri Light" w:hAnsi="Times New Roman" w:cs="Times New Roman"/>
-          <w:kern w:val="0"/>
-          <w:sz w:val="20"/>
-          <w:szCs w:val="20"/>
-          <w14:ligatures w14:val="none"/>
-        </w:rPr>
-        <w:t xml:space="preserve">, </w:t>
-      </w:r>
-      <w:r>
-        <w:rPr>
-          <w:rFonts w:ascii="Times New Roman" w:eastAsia="Calibri Light" w:hAnsi="Times New Roman" w:cs="Times New Roman"/>
+          <w:sz w:val="20"/>
+          <w:szCs w:val="20"/>
+          <w:lang w:val="en"/>
+        </w:rPr>
+        <w:t>Campus Activities Board</w:t>
+      </w:r>
+      <w:r>
+        <w:rPr>
+          <w:rFonts w:ascii="Times New Roman" w:hAnsi="Times New Roman" w:cs="Times New Roman"/>
           <w:i/>
           <w:iCs/>
-          <w:kern w:val="0"/>
-          <w:sz w:val="20"/>
-          <w:szCs w:val="20"/>
-          <w:lang w:val="en"/>
-          <w14:ligatures w14:val="none"/>
-        </w:rPr>
-        <w:t>Aladdin’s Eatery - McMurray</w:t>
-      </w:r>
-      <w:r>
-        <w:rPr>
-          <w:rFonts w:ascii="Times New Roman" w:eastAsia="Calibri Light" w:hAnsi="Times New Roman" w:cs="Times New Roman"/>
-          <w:kern w:val="0"/>
-          <w:sz w:val="20"/>
-          <w:szCs w:val="20"/>
-          <w14:ligatures w14:val="none"/>
+          <w:sz w:val="20"/>
+          <w:szCs w:val="20"/>
+        </w:rPr>
+        <w:t>, Point Park University</w:t>
+      </w:r>
+      <w:r>
+        <w:rPr>
+          <w:rFonts w:ascii="Times New Roman" w:hAnsi="Times New Roman" w:cs="Times New Roman"/>
+          <w:sz w:val="20"/>
+          <w:szCs w:val="20"/>
         </w:rPr>
         <w:tab/>
       </w:r>
       <w:r>
         <w:rPr>
-          <w:rFonts w:ascii="Times New Roman" w:eastAsia="Calibri Light" w:hAnsi="Times New Roman" w:cs="Times New Roman"/>
-          <w:kern w:val="0"/>
-          <w:sz w:val="20"/>
-          <w:szCs w:val="20"/>
-          <w:lang w:val="en"/>
-          <w14:ligatures w14:val="none"/>
-        </w:rPr>
-        <w:t xml:space="preserve">August 2021 - Present </w:t>
-      </w:r>
-    </w:p>
-    <w:p>
-      <w:pPr>
+          <w:rFonts w:ascii="Times New Roman" w:hAnsi="Times New Roman" w:cs="Times New Roman"/>
+          <w:sz w:val="20"/>
+          <w:szCs w:val="20"/>
+          <w:lang w:val="en"/>
+        </w:rPr>
+        <w:t>August 202</w:t>
+      </w:r>
+      <w:r>
+        <w:rPr>
+          <w:rFonts w:ascii="Times New Roman" w:hAnsi="Times New Roman" w:cs="Times New Roman"/>
+          <w:sz w:val="20"/>
+          <w:szCs w:val="20"/>
+          <w:lang w:val="en"/>
+        </w:rPr>
+        <w:t>5</w:t>
+      </w:r>
+      <w:r>
+        <w:rPr>
+          <w:rFonts w:ascii="Times New Roman" w:hAnsi="Times New Roman" w:cs="Times New Roman"/>
+          <w:sz w:val="20"/>
+          <w:szCs w:val="20"/>
+          <w:lang w:val="en"/>
+        </w:rPr>
+        <w:t xml:space="preserve"> - Present</w:t>
+      </w:r>
+    </w:p>
+    <w:p>
+      <w:pPr>
+        <w:pStyle w:val="ListParagraph"/>
         <w:widowControl w:val="0"/>
         <w:numPr>
           <w:ilvl w:val="0"/>
-          <w:numId w:val="2"/>
+          <w:numId w:val="1"/>
         </w:numPr>
         <w:autoSpaceDE w:val="0"/>
         <w:autoSpaceDN w:val="0"/>
         <w:spacing w:line="276" w:lineRule="auto"/>
         <w:ind w:left="270" w:hanging="270"/>
-        <w:contextualSpacing/>
-        <w:rPr>
-          <w:rFonts w:ascii="Times New Roman" w:eastAsia="Calibri Light" w:hAnsi="Times New Roman" w:cs="Times New Roman"/>
-          <w:kern w:val="0"/>
-          <w:sz w:val="20"/>
-          <w:szCs w:val="20"/>
-          <w14:ligatures w14:val="none"/>
-        </w:rPr>
-      </w:pPr>
-      <w:r>
-        <w:rPr>
-          <w:rFonts w:ascii="Times New Roman" w:eastAsia="Calibri Light" w:hAnsi="Times New Roman" w:cs="Times New Roman"/>
-          <w:kern w:val="0"/>
-          <w:sz w:val="20"/>
-          <w:szCs w:val="20"/>
-          <w14:ligatures w14:val="none"/>
-        </w:rPr>
-        <w:t>Memoriz</w:t>
-      </w:r>
-      <w:r>
-        <w:rPr>
-          <w:rFonts w:ascii="Times New Roman" w:eastAsia="Calibri Light" w:hAnsi="Times New Roman" w:cs="Times New Roman"/>
-          <w:kern w:val="0"/>
-          <w:sz w:val="20"/>
-          <w:szCs w:val="20"/>
-          <w14:ligatures w14:val="none"/>
-        </w:rPr>
-        <w:t>e</w:t>
-      </w:r>
-      <w:r>
-        <w:rPr>
-          <w:rFonts w:ascii="Times New Roman" w:eastAsia="Calibri Light" w:hAnsi="Times New Roman" w:cs="Times New Roman"/>
-          <w:kern w:val="0"/>
-          <w:sz w:val="20"/>
-          <w:szCs w:val="20"/>
-          <w14:ligatures w14:val="none"/>
-        </w:rPr>
-        <w:t xml:space="preserve"> 100% of menu items and preparation methods, including special Lebanese cuisine methods and ingredients</w:t>
-      </w:r>
-    </w:p>
-    <w:p>
-      <w:pPr>
+        <w:rPr>
+          <w:rFonts w:ascii="Times New Roman" w:hAnsi="Times New Roman" w:cs="Times New Roman"/>
+          <w:sz w:val="20"/>
+          <w:szCs w:val="20"/>
+          <w:lang w:val="en"/>
+        </w:rPr>
+      </w:pPr>
+      <w:r>
+        <w:rPr>
+          <w:rFonts w:ascii="Times New Roman" w:hAnsi="Times New Roman" w:cs="Times New Roman"/>
+          <w:sz w:val="20"/>
+          <w:szCs w:val="20"/>
+          <w:lang w:val="en"/>
+        </w:rPr>
+        <w:t>Managed an annual budget for the university’s largest student activities organization</w:t>
+      </w:r>
+    </w:p>
+    <w:p>
+      <w:pPr>
+        <w:pStyle w:val="ListParagraph"/>
         <w:widowControl w:val="0"/>
         <w:numPr>
           <w:ilvl w:val="0"/>
-          <w:numId w:val="2"/>
+          <w:numId w:val="1"/>
         </w:numPr>
         <w:autoSpaceDE w:val="0"/>
         <w:autoSpaceDN w:val="0"/>
         <w:spacing w:line="276" w:lineRule="auto"/>
         <w:ind w:left="270" w:hanging="270"/>
-        <w:contextualSpacing/>
-        <w:rPr>
-          <w:rFonts w:ascii="Times New Roman" w:eastAsia="Calibri Light" w:hAnsi="Times New Roman" w:cs="Times New Roman"/>
-          <w:kern w:val="0"/>
-          <w:sz w:val="20"/>
-          <w:szCs w:val="20"/>
-          <w14:ligatures w14:val="none"/>
-        </w:rPr>
-      </w:pPr>
-      <w:r>
-        <w:rPr>
-          <w:rFonts w:ascii="Times New Roman" w:eastAsia="Calibri Light" w:hAnsi="Times New Roman" w:cs="Times New Roman"/>
-          <w:kern w:val="0"/>
-          <w:sz w:val="20"/>
-          <w:szCs w:val="20"/>
-          <w14:ligatures w14:val="none"/>
-        </w:rPr>
-        <w:t>Analyz</w:t>
-      </w:r>
-      <w:r>
-        <w:rPr>
-          <w:rFonts w:ascii="Times New Roman" w:eastAsia="Calibri Light" w:hAnsi="Times New Roman" w:cs="Times New Roman"/>
-          <w:kern w:val="0"/>
-          <w:sz w:val="20"/>
-          <w:szCs w:val="20"/>
-          <w14:ligatures w14:val="none"/>
-        </w:rPr>
-        <w:t>e</w:t>
-      </w:r>
-      <w:r>
-        <w:rPr>
-          <w:rFonts w:ascii="Times New Roman" w:eastAsia="Calibri Light" w:hAnsi="Times New Roman" w:cs="Times New Roman"/>
-          <w:kern w:val="0"/>
-          <w:sz w:val="20"/>
-          <w:szCs w:val="20"/>
-          <w14:ligatures w14:val="none"/>
-        </w:rPr>
-        <w:t xml:space="preserve"> and read sales and register reports to ensure financial integrity every shift</w:t>
-      </w:r>
-    </w:p>
-    <w:p>
-      <w:pPr>
+        <w:rPr>
+          <w:rFonts w:ascii="Times New Roman" w:hAnsi="Times New Roman" w:cs="Times New Roman"/>
+          <w:sz w:val="20"/>
+          <w:szCs w:val="20"/>
+          <w:lang w:val="en"/>
+        </w:rPr>
+      </w:pPr>
+      <w:r>
+        <w:rPr>
+          <w:rFonts w:ascii="Times New Roman" w:hAnsi="Times New Roman" w:cs="Times New Roman"/>
+          <w:sz w:val="20"/>
+          <w:szCs w:val="20"/>
+          <w:lang w:val="en"/>
+        </w:rPr>
+        <w:t>Oversaw purchase requests, vendor payments, and event funding</w:t>
+      </w:r>
+    </w:p>
+    <w:p>
+      <w:pPr>
+        <w:pStyle w:val="ListParagraph"/>
         <w:widowControl w:val="0"/>
         <w:numPr>
           <w:ilvl w:val="0"/>
-          <w:numId w:val="2"/>
+          <w:numId w:val="1"/>
         </w:numPr>
         <w:autoSpaceDE w:val="0"/>
         <w:autoSpaceDN w:val="0"/>
         <w:spacing w:line="276" w:lineRule="auto"/>
         <w:ind w:left="270" w:hanging="270"/>
-        <w:contextualSpacing/>
-        <w:rPr>
-          <w:rFonts w:ascii="Times New Roman" w:eastAsia="Calibri Light" w:hAnsi="Times New Roman" w:cs="Times New Roman"/>
-          <w:kern w:val="0"/>
-          <w:sz w:val="20"/>
-          <w:szCs w:val="20"/>
-          <w14:ligatures w14:val="none"/>
-        </w:rPr>
-      </w:pPr>
-      <w:r>
-        <w:rPr>
-          <w:rFonts w:ascii="Times New Roman" w:eastAsia="Calibri Light" w:hAnsi="Times New Roman" w:cs="Times New Roman"/>
-          <w:kern w:val="0"/>
-          <w:sz w:val="20"/>
-          <w:szCs w:val="20"/>
-          <w14:ligatures w14:val="none"/>
-        </w:rPr>
-        <w:t>Train</w:t>
-      </w:r>
-      <w:r>
-        <w:rPr>
-          <w:rFonts w:ascii="Times New Roman" w:eastAsia="Calibri Light" w:hAnsi="Times New Roman" w:cs="Times New Roman"/>
-          <w:kern w:val="0"/>
-          <w:sz w:val="20"/>
-          <w:szCs w:val="20"/>
-          <w14:ligatures w14:val="none"/>
-        </w:rPr>
-        <w:t>ed</w:t>
-      </w:r>
-      <w:r>
-        <w:rPr>
-          <w:rFonts w:ascii="Times New Roman" w:eastAsia="Calibri Light" w:hAnsi="Times New Roman" w:cs="Times New Roman"/>
-          <w:kern w:val="0"/>
-          <w:sz w:val="20"/>
-          <w:szCs w:val="20"/>
-          <w14:ligatures w14:val="none"/>
-        </w:rPr>
-        <w:t xml:space="preserve"> and mentored 10+ servers</w:t>
+        <w:rPr>
+          <w:rFonts w:ascii="Times New Roman" w:hAnsi="Times New Roman" w:cs="Times New Roman"/>
+          <w:sz w:val="20"/>
+          <w:szCs w:val="20"/>
+          <w:lang w:val="en"/>
+        </w:rPr>
+      </w:pPr>
+      <w:r>
+        <w:rPr>
+          <w:rFonts w:ascii="Times New Roman" w:hAnsi="Times New Roman" w:cs="Times New Roman"/>
+          <w:sz w:val="20"/>
+          <w:szCs w:val="20"/>
+          <w:lang w:val="en"/>
+        </w:rPr>
+        <w:t>Ensured accurate and clearly organized tracking of expenses and invoices</w:t>
       </w:r>
     </w:p>
     <w:p>
@@ -1020,202 +1047,396 @@
         <w:autoSpaceDE w:val="0"/>
         <w:autoSpaceDN w:val="0"/>
         <w:spacing w:line="276" w:lineRule="auto"/>
-        <w:ind w:left="270" w:hanging="270"/>
-        <w:rPr>
-          <w:rFonts w:ascii="Times New Roman" w:eastAsia="Calibri Light" w:hAnsi="Times New Roman" w:cs="Times New Roman"/>
-          <w:kern w:val="0"/>
-          <w:sz w:val="20"/>
-          <w:szCs w:val="20"/>
-          <w14:ligatures w14:val="none"/>
-        </w:rPr>
-      </w:pPr>
-    </w:p>
-    <w:p>
-      <w:pPr>
-        <w:widowControl w:val="0"/>
+        <w:rPr>
+          <w:rFonts w:ascii="Times New Roman" w:eastAsia="Calibri Light" w:hAnsi="Times New Roman" w:cs="Times New Roman"/>
+          <w:kern w:val="0"/>
+          <w:sz w:val="20"/>
+          <w:szCs w:val="20"/>
+          <w14:ligatures w14:val="none"/>
+        </w:rPr>
+      </w:pPr>
+    </w:p>
+    <w:p>
+      <w:pPr>
         <w:tabs>
-          <w:tab w:val="left" w:pos="8280"/>
+          <w:tab w:val="left" w:pos="8640"/>
         </w:tabs>
-        <w:autoSpaceDE w:val="0"/>
-        <w:autoSpaceDN w:val="0"/>
         <w:spacing w:line="276" w:lineRule="auto"/>
         <w:ind w:left="270" w:hanging="270"/>
         <w:rPr>
-          <w:rFonts w:ascii="Times New Roman" w:eastAsia="Calibri Light" w:hAnsi="Times New Roman" w:cs="Times New Roman"/>
+          <w:rFonts w:ascii="Times New Roman" w:hAnsi="Times New Roman" w:cs="Times New Roman"/>
           <w:i/>
-          <w:kern w:val="0"/>
-          <w:sz w:val="20"/>
-          <w:szCs w:val="20"/>
-          <w:lang w:val="en"/>
-          <w14:ligatures w14:val="none"/>
-        </w:rPr>
-      </w:pPr>
-      <w:bookmarkStart w:id="0" w:name="_meesvwiaddgg" w:colFirst="0" w:colLast="0"/>
-      <w:bookmarkStart w:id="1" w:name="_gadkliuq1m4" w:colFirst="0" w:colLast="0"/>
-      <w:bookmarkEnd w:id="0"/>
-      <w:bookmarkEnd w:id="1"/>
-      <w:r>
-        <w:rPr>
-          <w:rFonts w:ascii="Times New Roman" w:eastAsia="Calibri Light" w:hAnsi="Times New Roman" w:cs="Times New Roman"/>
+          <w:sz w:val="20"/>
+          <w:szCs w:val="20"/>
+          <w:lang w:val="en"/>
+        </w:rPr>
+      </w:pPr>
+      <w:r>
+        <w:rPr>
+          <w:rFonts w:ascii="Times New Roman" w:hAnsi="Times New Roman" w:cs="Times New Roman"/>
           <w:b/>
           <w:bCs/>
-          <w:kern w:val="0"/>
-          <w:sz w:val="20"/>
-          <w:szCs w:val="20"/>
-          <w:lang w:val="en"/>
-          <w14:ligatures w14:val="none"/>
-        </w:rPr>
-        <w:t>Customer Service Representative</w:t>
-      </w:r>
-      <w:bookmarkStart w:id="2" w:name="_n64fgzu3lwuy" w:colFirst="0" w:colLast="0"/>
-      <w:bookmarkEnd w:id="2"/>
-      <w:r>
-        <w:rPr>
-          <w:rFonts w:ascii="Times New Roman" w:eastAsia="Calibri Light" w:hAnsi="Times New Roman" w:cs="Times New Roman"/>
-          <w:b/>
-          <w:bCs/>
-          <w:kern w:val="0"/>
-          <w:sz w:val="20"/>
-          <w:szCs w:val="20"/>
-          <w:lang w:val="en"/>
-          <w14:ligatures w14:val="none"/>
-        </w:rPr>
-        <w:t>,</w:t>
-      </w:r>
-      <w:r>
-        <w:rPr>
-          <w:rFonts w:ascii="Times New Roman" w:eastAsia="Calibri Light" w:hAnsi="Times New Roman" w:cs="Times New Roman"/>
-          <w:kern w:val="0"/>
-          <w:sz w:val="20"/>
-          <w:szCs w:val="20"/>
-          <w14:ligatures w14:val="none"/>
-        </w:rPr>
-        <w:t xml:space="preserve"> </w:t>
-      </w:r>
-      <w:r>
-        <w:rPr>
-          <w:rFonts w:ascii="Times New Roman" w:eastAsia="Calibri Light" w:hAnsi="Times New Roman" w:cs="Times New Roman"/>
+          <w:sz w:val="20"/>
+          <w:szCs w:val="20"/>
+          <w:lang w:val="en"/>
+        </w:rPr>
+        <w:t>Tutor</w:t>
+      </w:r>
+      <w:r>
+        <w:rPr>
+          <w:rFonts w:ascii="Times New Roman" w:hAnsi="Times New Roman" w:cs="Times New Roman"/>
+          <w:sz w:val="20"/>
+          <w:szCs w:val="20"/>
+        </w:rPr>
+        <w:t xml:space="preserve">, </w:t>
+      </w:r>
+      <w:r>
+        <w:rPr>
+          <w:rFonts w:ascii="Times New Roman" w:hAnsi="Times New Roman" w:cs="Times New Roman"/>
           <w:i/>
           <w:iCs/>
-          <w:kern w:val="0"/>
-          <w:sz w:val="20"/>
-          <w:szCs w:val="20"/>
-          <w14:ligatures w14:val="none"/>
-        </w:rPr>
-        <w:t>Jewish Community Center</w:t>
-      </w:r>
-      <w:r>
-        <w:rPr>
-          <w:rFonts w:ascii="Times New Roman" w:eastAsia="Calibri Light" w:hAnsi="Times New Roman" w:cs="Times New Roman"/>
-          <w:i/>
-          <w:iCs/>
-          <w:kern w:val="0"/>
-          <w:sz w:val="20"/>
-          <w:szCs w:val="20"/>
-          <w14:ligatures w14:val="none"/>
+          <w:sz w:val="20"/>
+          <w:szCs w:val="20"/>
+          <w:lang w:val="en"/>
+        </w:rPr>
+        <w:t>Tutoring and Writing Center, Point Park University</w:t>
+      </w:r>
+      <w:r>
+        <w:rPr>
+          <w:rFonts w:ascii="Times New Roman" w:hAnsi="Times New Roman" w:cs="Times New Roman"/>
+          <w:sz w:val="20"/>
+          <w:szCs w:val="20"/>
         </w:rPr>
         <w:tab/>
       </w:r>
       <w:r>
         <w:rPr>
-          <w:rFonts w:ascii="Times New Roman" w:eastAsia="Calibri Light" w:hAnsi="Times New Roman" w:cs="Times New Roman"/>
-          <w:kern w:val="0"/>
-          <w:sz w:val="20"/>
-          <w:szCs w:val="20"/>
-          <w:lang w:val="en"/>
-          <w14:ligatures w14:val="none"/>
-        </w:rPr>
-        <w:t>August 2023 - December 2023</w:t>
-      </w:r>
-    </w:p>
-    <w:p>
-      <w:pPr>
+          <w:rFonts w:ascii="Times New Roman" w:hAnsi="Times New Roman" w:cs="Times New Roman"/>
+          <w:sz w:val="20"/>
+          <w:szCs w:val="20"/>
+          <w:lang w:val="en"/>
+        </w:rPr>
+        <w:t>September</w:t>
+      </w:r>
+      <w:r>
+        <w:rPr>
+          <w:rFonts w:ascii="Times New Roman" w:hAnsi="Times New Roman" w:cs="Times New Roman"/>
+          <w:sz w:val="20"/>
+          <w:szCs w:val="20"/>
+          <w:lang w:val="en"/>
+        </w:rPr>
+        <w:t xml:space="preserve"> 202</w:t>
+      </w:r>
+      <w:r>
+        <w:rPr>
+          <w:rFonts w:ascii="Times New Roman" w:hAnsi="Times New Roman" w:cs="Times New Roman"/>
+          <w:sz w:val="20"/>
+          <w:szCs w:val="20"/>
+          <w:lang w:val="en"/>
+        </w:rPr>
+        <w:t xml:space="preserve">5 – </w:t>
+      </w:r>
+      <w:r>
+        <w:rPr>
+          <w:rFonts w:ascii="Times New Roman" w:hAnsi="Times New Roman" w:cs="Times New Roman"/>
+          <w:sz w:val="20"/>
+          <w:szCs w:val="20"/>
+          <w:lang w:val="en"/>
+        </w:rPr>
+        <w:t>Present</w:t>
+      </w:r>
+    </w:p>
+    <w:p>
+      <w:pPr>
+        <w:pStyle w:val="ListParagraph"/>
         <w:widowControl w:val="0"/>
         <w:numPr>
           <w:ilvl w:val="0"/>
-          <w:numId w:val="3"/>
+          <w:numId w:val="6"/>
         </w:numPr>
         <w:autoSpaceDE w:val="0"/>
         <w:autoSpaceDN w:val="0"/>
         <w:spacing w:line="276" w:lineRule="auto"/>
         <w:ind w:left="270" w:hanging="270"/>
         <w:rPr>
-          <w:rFonts w:ascii="Times New Roman" w:eastAsia="Calibri Light" w:hAnsi="Times New Roman" w:cs="Times New Roman"/>
-          <w:kern w:val="0"/>
-          <w:sz w:val="20"/>
-          <w:szCs w:val="20"/>
-          <w14:ligatures w14:val="none"/>
-        </w:rPr>
-      </w:pPr>
-      <w:r>
-        <w:rPr>
-          <w:rFonts w:ascii="Times New Roman" w:eastAsia="Calibri Light" w:hAnsi="Times New Roman" w:cs="Times New Roman"/>
-          <w:kern w:val="0"/>
-          <w:sz w:val="20"/>
-          <w:szCs w:val="20"/>
-          <w14:ligatures w14:val="none"/>
-        </w:rPr>
-        <w:t>Received a deep understanding of organizational programs, events, and offices</w:t>
-      </w:r>
-    </w:p>
-    <w:p>
-      <w:pPr>
+          <w:rFonts w:ascii="Times New Roman" w:hAnsi="Times New Roman" w:cs="Times New Roman"/>
+          <w:sz w:val="20"/>
+          <w:szCs w:val="20"/>
+          <w:lang w:val="en"/>
+        </w:rPr>
+      </w:pPr>
+      <w:r>
+        <w:rPr>
+          <w:rFonts w:ascii="Times New Roman" w:hAnsi="Times New Roman" w:cs="Times New Roman"/>
+          <w:sz w:val="20"/>
+          <w:szCs w:val="20"/>
+          <w:lang w:val="en"/>
+        </w:rPr>
+        <w:t>Tutored 15 business, accounting, and computer science courses</w:t>
+      </w:r>
+    </w:p>
+    <w:p>
+      <w:pPr>
+        <w:pStyle w:val="ListParagraph"/>
         <w:widowControl w:val="0"/>
         <w:numPr>
           <w:ilvl w:val="0"/>
-          <w:numId w:val="3"/>
+          <w:numId w:val="6"/>
         </w:numPr>
         <w:autoSpaceDE w:val="0"/>
         <w:autoSpaceDN w:val="0"/>
         <w:spacing w:line="276" w:lineRule="auto"/>
         <w:ind w:left="270" w:hanging="270"/>
         <w:rPr>
-          <w:rFonts w:ascii="Times New Roman" w:eastAsia="Calibri Light" w:hAnsi="Times New Roman" w:cs="Times New Roman"/>
-          <w:kern w:val="0"/>
-          <w:sz w:val="20"/>
-          <w:szCs w:val="20"/>
-          <w14:ligatures w14:val="none"/>
-        </w:rPr>
-      </w:pPr>
-      <w:r>
-        <w:rPr>
-          <w:rFonts w:ascii="Times New Roman" w:eastAsia="Calibri Light" w:hAnsi="Times New Roman" w:cs="Times New Roman"/>
-          <w:kern w:val="0"/>
-          <w:sz w:val="20"/>
-          <w:szCs w:val="20"/>
-          <w14:ligatures w14:val="none"/>
-        </w:rPr>
-        <w:t>Answered 10+ phone calls per shift while redirecting callers to the appropriate extension</w:t>
-      </w:r>
-    </w:p>
-    <w:p>
-      <w:pPr>
+          <w:rFonts w:ascii="Times New Roman" w:hAnsi="Times New Roman" w:cs="Times New Roman"/>
+          <w:sz w:val="20"/>
+          <w:szCs w:val="20"/>
+          <w:lang w:val="en"/>
+        </w:rPr>
+      </w:pPr>
+      <w:r>
+        <w:rPr>
+          <w:rFonts w:ascii="Times New Roman" w:hAnsi="Times New Roman" w:cs="Times New Roman"/>
+          <w:sz w:val="20"/>
+          <w:szCs w:val="20"/>
+          <w:lang w:val="en"/>
+        </w:rPr>
+        <w:t>Filed client report forms to document progress and topics covered</w:t>
+      </w:r>
+    </w:p>
+    <w:p>
+      <w:pPr>
+        <w:pStyle w:val="ListParagraph"/>
         <w:widowControl w:val="0"/>
         <w:numPr>
           <w:ilvl w:val="0"/>
-          <w:numId w:val="3"/>
+          <w:numId w:val="6"/>
         </w:numPr>
         <w:autoSpaceDE w:val="0"/>
         <w:autoSpaceDN w:val="0"/>
         <w:spacing w:line="276" w:lineRule="auto"/>
         <w:ind w:left="270" w:hanging="270"/>
         <w:rPr>
-          <w:rFonts w:ascii="Times New Roman" w:eastAsia="Calibri Light" w:hAnsi="Times New Roman" w:cs="Times New Roman"/>
-          <w:kern w:val="0"/>
-          <w:sz w:val="20"/>
-          <w:szCs w:val="20"/>
-          <w14:ligatures w14:val="none"/>
-        </w:rPr>
-      </w:pPr>
-      <w:r>
-        <w:rPr>
-          <w:rFonts w:ascii="Times New Roman" w:eastAsia="Calibri Light" w:hAnsi="Times New Roman" w:cs="Times New Roman"/>
-          <w:kern w:val="0"/>
-          <w:sz w:val="20"/>
-          <w:szCs w:val="20"/>
-          <w14:ligatures w14:val="none"/>
-        </w:rPr>
-        <w:t>Conducted 25+ transactions for swim classes, guest passes, and day passes</w:t>
+          <w:rFonts w:ascii="Times New Roman" w:hAnsi="Times New Roman" w:cs="Times New Roman"/>
+          <w:sz w:val="20"/>
+          <w:szCs w:val="20"/>
+          <w:lang w:val="en"/>
+        </w:rPr>
+      </w:pPr>
+      <w:r>
+        <w:rPr>
+          <w:rFonts w:ascii="Times New Roman" w:hAnsi="Times New Roman" w:cs="Times New Roman"/>
+          <w:sz w:val="20"/>
+          <w:szCs w:val="20"/>
+          <w:lang w:val="en"/>
+        </w:rPr>
+        <w:t>Aided in improving student study plans and exam results</w:t>
+      </w:r>
+    </w:p>
+    <w:p>
+      <w:pPr>
+        <w:widowControl w:val="0"/>
+        <w:autoSpaceDE w:val="0"/>
+        <w:autoSpaceDN w:val="0"/>
+        <w:spacing w:line="276" w:lineRule="auto"/>
+        <w:rPr>
+          <w:rFonts w:ascii="Times New Roman" w:eastAsia="Calibri Light" w:hAnsi="Times New Roman" w:cs="Times New Roman"/>
+          <w:kern w:val="0"/>
+          <w:sz w:val="20"/>
+          <w:szCs w:val="20"/>
+          <w14:ligatures w14:val="none"/>
+        </w:rPr>
+      </w:pPr>
+    </w:p>
+    <w:p>
+      <w:pPr>
+        <w:tabs>
+          <w:tab w:val="left" w:pos="9990"/>
+        </w:tabs>
+        <w:spacing w:line="276" w:lineRule="auto"/>
+        <w:ind w:left="270" w:hanging="270"/>
+        <w:rPr>
+          <w:rFonts w:ascii="Times New Roman" w:hAnsi="Times New Roman" w:cs="Times New Roman"/>
+          <w:i/>
+          <w:sz w:val="20"/>
+          <w:szCs w:val="20"/>
+          <w:lang w:val="en"/>
+        </w:rPr>
+      </w:pPr>
+      <w:bookmarkStart w:id="0" w:name="_meesvwiaddgg" w:colFirst="0" w:colLast="0"/>
+      <w:bookmarkStart w:id="1" w:name="_gadkliuq1m4" w:colFirst="0" w:colLast="0"/>
+      <w:bookmarkEnd w:id="0"/>
+      <w:bookmarkEnd w:id="1"/>
+      <w:r>
+        <w:rPr>
+          <w:rFonts w:ascii="Times New Roman" w:hAnsi="Times New Roman" w:cs="Times New Roman"/>
+          <w:b/>
+          <w:bCs/>
+          <w:sz w:val="20"/>
+          <w:szCs w:val="20"/>
+          <w:lang w:val="en"/>
+        </w:rPr>
+        <w:t>Business Camp Counselor</w:t>
+      </w:r>
+      <w:r>
+        <w:rPr>
+          <w:rFonts w:ascii="Times New Roman" w:hAnsi="Times New Roman" w:cs="Times New Roman"/>
+          <w:sz w:val="20"/>
+          <w:szCs w:val="20"/>
+        </w:rPr>
+        <w:t xml:space="preserve">, </w:t>
+      </w:r>
+      <w:r>
+        <w:rPr>
+          <w:rFonts w:ascii="Times New Roman" w:hAnsi="Times New Roman" w:cs="Times New Roman"/>
+          <w:i/>
+          <w:iCs/>
+          <w:sz w:val="20"/>
+          <w:szCs w:val="20"/>
+          <w:lang w:val="en"/>
+        </w:rPr>
+        <w:t>Accelerated Career Awareness Program</w:t>
+      </w:r>
+      <w:r>
+        <w:rPr>
+          <w:rFonts w:ascii="Times New Roman" w:hAnsi="Times New Roman" w:cs="Times New Roman"/>
+          <w:i/>
+          <w:iCs/>
+          <w:sz w:val="20"/>
+          <w:szCs w:val="20"/>
+        </w:rPr>
+        <w:t>, Point Park University</w:t>
+      </w:r>
+      <w:r>
+        <w:rPr>
+          <w:rFonts w:ascii="Times New Roman" w:hAnsi="Times New Roman" w:cs="Times New Roman"/>
+          <w:sz w:val="20"/>
+          <w:szCs w:val="20"/>
+        </w:rPr>
+        <w:tab/>
+      </w:r>
+      <w:r>
+        <w:rPr>
+          <w:rFonts w:ascii="Times New Roman" w:hAnsi="Times New Roman" w:cs="Times New Roman"/>
+          <w:sz w:val="20"/>
+          <w:szCs w:val="20"/>
+          <w:lang w:val="en"/>
+        </w:rPr>
+        <w:t>July</w:t>
+      </w:r>
+      <w:r>
+        <w:rPr>
+          <w:rFonts w:ascii="Times New Roman" w:hAnsi="Times New Roman" w:cs="Times New Roman"/>
+          <w:sz w:val="20"/>
+          <w:szCs w:val="20"/>
+          <w:lang w:val="en"/>
+        </w:rPr>
+        <w:t xml:space="preserve"> 202</w:t>
+      </w:r>
+      <w:r>
+        <w:rPr>
+          <w:rFonts w:ascii="Times New Roman" w:hAnsi="Times New Roman" w:cs="Times New Roman"/>
+          <w:sz w:val="20"/>
+          <w:szCs w:val="20"/>
+          <w:lang w:val="en"/>
+        </w:rPr>
+        <w:t>5</w:t>
+      </w:r>
+    </w:p>
+    <w:p>
+      <w:pPr>
+        <w:pStyle w:val="ListParagraph"/>
+        <w:widowControl w:val="0"/>
+        <w:numPr>
+          <w:ilvl w:val="0"/>
+          <w:numId w:val="6"/>
+        </w:numPr>
+        <w:autoSpaceDE w:val="0"/>
+        <w:autoSpaceDN w:val="0"/>
+        <w:spacing w:line="276" w:lineRule="auto"/>
+        <w:ind w:left="270" w:hanging="270"/>
+        <w:rPr>
+          <w:rFonts w:ascii="Times New Roman" w:hAnsi="Times New Roman" w:cs="Times New Roman"/>
+          <w:sz w:val="20"/>
+          <w:szCs w:val="20"/>
+          <w:lang w:val="en"/>
+        </w:rPr>
+      </w:pPr>
+      <w:r>
+        <w:rPr>
+          <w:rFonts w:ascii="Times New Roman" w:hAnsi="Times New Roman" w:cs="Times New Roman"/>
+          <w:sz w:val="20"/>
+          <w:szCs w:val="20"/>
+          <w:lang w:val="en"/>
+        </w:rPr>
+        <w:t>Mentored and supervised high school students exploring careers</w:t>
+      </w:r>
+      <w:r>
+        <w:rPr>
+          <w:rFonts w:ascii="Times New Roman" w:hAnsi="Times New Roman" w:cs="Times New Roman"/>
+          <w:sz w:val="20"/>
+          <w:szCs w:val="20"/>
+          <w:lang w:val="en"/>
+        </w:rPr>
+        <w:t xml:space="preserve"> in business, accounting, finance, and entrepreneurship.</w:t>
+      </w:r>
+    </w:p>
+    <w:p>
+      <w:pPr>
+        <w:pStyle w:val="ListParagraph"/>
+        <w:widowControl w:val="0"/>
+        <w:numPr>
+          <w:ilvl w:val="0"/>
+          <w:numId w:val="6"/>
+        </w:numPr>
+        <w:autoSpaceDE w:val="0"/>
+        <w:autoSpaceDN w:val="0"/>
+        <w:spacing w:line="276" w:lineRule="auto"/>
+        <w:ind w:left="270" w:hanging="270"/>
+        <w:rPr>
+          <w:rFonts w:ascii="Times New Roman" w:hAnsi="Times New Roman" w:cs="Times New Roman"/>
+          <w:sz w:val="20"/>
+          <w:szCs w:val="20"/>
+          <w:lang w:val="en"/>
+        </w:rPr>
+      </w:pPr>
+      <w:r>
+        <w:rPr>
+          <w:rFonts w:ascii="Times New Roman" w:hAnsi="Times New Roman" w:cs="Times New Roman"/>
+          <w:sz w:val="20"/>
+          <w:szCs w:val="20"/>
+          <w:lang w:val="en"/>
+        </w:rPr>
+        <w:t>Facilitated accounting and business workshops and promoted teamwork and problem solving</w:t>
+      </w:r>
+    </w:p>
+    <w:p>
+      <w:pPr>
+        <w:pStyle w:val="ListParagraph"/>
+        <w:widowControl w:val="0"/>
+        <w:numPr>
+          <w:ilvl w:val="0"/>
+          <w:numId w:val="6"/>
+        </w:numPr>
+        <w:autoSpaceDE w:val="0"/>
+        <w:autoSpaceDN w:val="0"/>
+        <w:spacing w:line="276" w:lineRule="auto"/>
+        <w:ind w:left="270" w:hanging="270"/>
+        <w:rPr>
+          <w:rFonts w:ascii="Times New Roman" w:hAnsi="Times New Roman" w:cs="Times New Roman"/>
+          <w:sz w:val="20"/>
+          <w:szCs w:val="20"/>
+          <w:lang w:val="en"/>
+        </w:rPr>
+      </w:pPr>
+      <w:r>
+        <w:rPr>
+          <w:rFonts w:ascii="Times New Roman" w:hAnsi="Times New Roman" w:cs="Times New Roman"/>
+          <w:sz w:val="20"/>
+          <w:szCs w:val="20"/>
+          <w:lang w:val="en"/>
+        </w:rPr>
+        <w:t>Provided guidance and support to students as the group visited 5+ firms around Pittsburgh</w:t>
       </w:r>
     </w:p>
     <w:p>
@@ -1244,7 +1465,6 @@
         <w:rPr>
           <w:rFonts w:ascii="Times New Roman" w:eastAsia="Calibri Light" w:hAnsi="Times New Roman" w:cs="Times New Roman"/>
           <w:b/>
-          <w:bCs/>
           <w:color w:val="4472C4"/>
           <w:kern w:val="0"/>
           <w:sz w:val="20"/>
@@ -1262,163 +1482,236 @@
           <w:szCs w:val="20"/>
           <w14:ligatures w14:val="none"/>
         </w:rPr>
-        <w:t>PROJECTS</w:t>
-      </w:r>
-    </w:p>
-    <w:p>
-      <w:pPr>
-        <w:widowControl w:val="0"/>
+        <w:t>ORGANIZATIONS</w:t>
+      </w:r>
+    </w:p>
+    <w:p>
+      <w:pPr>
         <w:tabs>
-          <w:tab w:val="left" w:pos="8190"/>
+          <w:tab w:val="left" w:pos="9180"/>
         </w:tabs>
-        <w:autoSpaceDE w:val="0"/>
-        <w:autoSpaceDN w:val="0"/>
         <w:spacing w:line="276" w:lineRule="auto"/>
-        <w:ind w:left="450" w:hanging="450"/>
-        <w:rPr>
-          <w:rFonts w:ascii="Times New Roman" w:eastAsia="Calibri Light" w:hAnsi="Times New Roman" w:cs="Times New Roman"/>
-          <w:kern w:val="0"/>
-          <w:sz w:val="20"/>
-          <w:szCs w:val="20"/>
-          <w14:ligatures w14:val="none"/>
-        </w:rPr>
-      </w:pPr>
-      <w:r>
-        <w:rPr>
-          <w:rFonts w:ascii="Times New Roman" w:eastAsia="Calibri Light" w:hAnsi="Times New Roman" w:cs="Times New Roman"/>
-          <w:b/>
+        <w:rPr>
+          <w:rFonts w:ascii="Times New Roman" w:hAnsi="Times New Roman" w:cs="Times New Roman"/>
           <w:bCs/>
-          <w:kern w:val="0"/>
-          <w:sz w:val="20"/>
-          <w:szCs w:val="20"/>
-          <w14:ligatures w14:val="none"/>
-        </w:rPr>
-        <w:t xml:space="preserve">Cost-Volume-Profit Project </w:t>
-      </w:r>
-      <w:r>
-        <w:rPr>
-          <w:rFonts w:ascii="Times New Roman" w:eastAsia="Calibri Light" w:hAnsi="Times New Roman" w:cs="Times New Roman"/>
-          <w:kern w:val="0"/>
-          <w:sz w:val="20"/>
-          <w:szCs w:val="20"/>
-          <w14:ligatures w14:val="none"/>
-        </w:rPr>
-        <w:t>(Excel)</w:t>
-      </w:r>
-      <w:r>
-        <w:rPr>
-          <w:rFonts w:ascii="Times New Roman" w:eastAsia="Calibri Light" w:hAnsi="Times New Roman" w:cs="Times New Roman"/>
-          <w:kern w:val="0"/>
-          <w:sz w:val="20"/>
-          <w:szCs w:val="20"/>
-          <w14:ligatures w14:val="none"/>
+          <w:color w:val="000000"/>
+          <w:sz w:val="20"/>
+          <w:szCs w:val="20"/>
+        </w:rPr>
+      </w:pPr>
+      <w:r>
+        <w:rPr>
+          <w:rFonts w:ascii="Times New Roman" w:hAnsi="Times New Roman" w:cs="Times New Roman"/>
+          <w:bCs/>
+          <w:color w:val="000000"/>
+          <w:sz w:val="20"/>
+          <w:szCs w:val="20"/>
+        </w:rPr>
+        <w:t>President</w:t>
+      </w:r>
+      <w:r>
+        <w:rPr>
+          <w:rFonts w:ascii="Times New Roman" w:hAnsi="Times New Roman" w:cs="Times New Roman"/>
+          <w:bCs/>
+          <w:color w:val="000000"/>
+          <w:sz w:val="20"/>
+          <w:szCs w:val="20"/>
+        </w:rPr>
+        <w:t xml:space="preserve"> of Point Park’s Student Accounting Association</w:t>
+      </w:r>
+      <w:r>
+        <w:rPr>
+          <w:rFonts w:ascii="Times New Roman" w:hAnsi="Times New Roman" w:cs="Times New Roman"/>
+          <w:bCs/>
+          <w:color w:val="000000"/>
+          <w:sz w:val="20"/>
+          <w:szCs w:val="20"/>
         </w:rPr>
         <w:tab/>
-        <w:t>October 2024 – November 2024</w:t>
-      </w:r>
-    </w:p>
-    <w:p>
-      <w:pPr>
-        <w:widowControl w:val="0"/>
-        <w:numPr>
-          <w:ilvl w:val="0"/>
-          <w:numId w:val="5"/>
-        </w:numPr>
+      </w:r>
+      <w:r>
+        <w:rPr>
+          <w:rFonts w:ascii="Times New Roman" w:hAnsi="Times New Roman" w:cs="Times New Roman"/>
+          <w:bCs/>
+          <w:color w:val="000000"/>
+          <w:sz w:val="20"/>
+          <w:szCs w:val="20"/>
+        </w:rPr>
+        <w:t>May</w:t>
+      </w:r>
+      <w:r>
+        <w:rPr>
+          <w:rFonts w:ascii="Times New Roman" w:hAnsi="Times New Roman" w:cs="Times New Roman"/>
+          <w:bCs/>
+          <w:color w:val="000000"/>
+          <w:sz w:val="20"/>
+          <w:szCs w:val="20"/>
+        </w:rPr>
+        <w:t xml:space="preserve"> 202</w:t>
+      </w:r>
+      <w:r>
+        <w:rPr>
+          <w:rFonts w:ascii="Times New Roman" w:hAnsi="Times New Roman" w:cs="Times New Roman"/>
+          <w:bCs/>
+          <w:color w:val="000000"/>
+          <w:sz w:val="20"/>
+          <w:szCs w:val="20"/>
+        </w:rPr>
+        <w:t>6</w:t>
+      </w:r>
+      <w:r>
+        <w:rPr>
+          <w:rFonts w:ascii="Times New Roman" w:hAnsi="Times New Roman" w:cs="Times New Roman"/>
+          <w:bCs/>
+          <w:color w:val="000000"/>
+          <w:sz w:val="20"/>
+          <w:szCs w:val="20"/>
+        </w:rPr>
+        <w:t xml:space="preserve"> </w:t>
+      </w:r>
+      <w:r>
+        <w:rPr>
+          <w:rFonts w:ascii="Times New Roman" w:hAnsi="Times New Roman" w:cs="Times New Roman"/>
+          <w:bCs/>
+          <w:color w:val="000000"/>
+          <w:sz w:val="20"/>
+          <w:szCs w:val="20"/>
+        </w:rPr>
+        <w:t>–</w:t>
+      </w:r>
+      <w:r>
+        <w:rPr>
+          <w:rFonts w:ascii="Times New Roman" w:hAnsi="Times New Roman" w:cs="Times New Roman"/>
+          <w:bCs/>
+          <w:color w:val="000000"/>
+          <w:sz w:val="20"/>
+          <w:szCs w:val="20"/>
+        </w:rPr>
+        <w:t xml:space="preserve"> Present</w:t>
+      </w:r>
+    </w:p>
+    <w:p>
+      <w:pPr>
         <w:tabs>
-          <w:tab w:val="left" w:pos="8190"/>
+          <w:tab w:val="left" w:pos="8730"/>
         </w:tabs>
-        <w:autoSpaceDE w:val="0"/>
-        <w:autoSpaceDN w:val="0"/>
         <w:spacing w:line="276" w:lineRule="auto"/>
-        <w:ind w:left="270" w:hanging="270"/>
-        <w:contextualSpacing/>
-        <w:rPr>
-          <w:rFonts w:ascii="Times New Roman" w:eastAsia="Calibri Light" w:hAnsi="Times New Roman" w:cs="Times New Roman"/>
-          <w:kern w:val="0"/>
-          <w:sz w:val="20"/>
-          <w:szCs w:val="20"/>
-          <w14:ligatures w14:val="none"/>
-        </w:rPr>
-      </w:pPr>
-      <w:r>
-        <w:rPr>
-          <w:rFonts w:ascii="Times New Roman" w:eastAsia="Calibri Light" w:hAnsi="Times New Roman" w:cs="Times New Roman"/>
-          <w:kern w:val="0"/>
-          <w:sz w:val="20"/>
-          <w:szCs w:val="20"/>
-          <w14:ligatures w14:val="none"/>
-        </w:rPr>
-        <w:t>Created separate contribution format income statements for 2 fake theaters</w:t>
-      </w:r>
-    </w:p>
-    <w:p>
-      <w:pPr>
-        <w:widowControl w:val="0"/>
-        <w:numPr>
-          <w:ilvl w:val="0"/>
-          <w:numId w:val="5"/>
-        </w:numPr>
+        <w:rPr>
+          <w:rFonts w:ascii="Times New Roman" w:hAnsi="Times New Roman" w:cs="Times New Roman"/>
+          <w:bCs/>
+          <w:color w:val="000000"/>
+          <w:sz w:val="20"/>
+          <w:szCs w:val="20"/>
+        </w:rPr>
+      </w:pPr>
+      <w:r>
+        <w:rPr>
+          <w:rFonts w:ascii="Times New Roman" w:hAnsi="Times New Roman" w:cs="Times New Roman"/>
+          <w:bCs/>
+          <w:color w:val="000000"/>
+          <w:sz w:val="20"/>
+          <w:szCs w:val="20"/>
+        </w:rPr>
+        <w:t>Student Ambassador for the Institute of Internal Auditors</w:t>
+      </w:r>
+      <w:r>
+        <w:rPr>
+          <w:rFonts w:ascii="Times New Roman" w:hAnsi="Times New Roman" w:cs="Times New Roman"/>
+          <w:bCs/>
+          <w:color w:val="000000"/>
+          <w:sz w:val="20"/>
+          <w:szCs w:val="20"/>
+        </w:rPr>
+        <w:tab/>
+        <w:t>September 2025 - Present</w:t>
+      </w:r>
+    </w:p>
+    <w:p>
+      <w:pPr>
         <w:tabs>
-          <w:tab w:val="left" w:pos="8190"/>
+          <w:tab w:val="left" w:pos="8820"/>
         </w:tabs>
-        <w:autoSpaceDE w:val="0"/>
-        <w:autoSpaceDN w:val="0"/>
         <w:spacing w:line="276" w:lineRule="auto"/>
-        <w:ind w:left="270" w:hanging="270"/>
-        <w:contextualSpacing/>
-        <w:rPr>
-          <w:rFonts w:ascii="Times New Roman" w:eastAsia="Calibri Light" w:hAnsi="Times New Roman" w:cs="Times New Roman"/>
-          <w:kern w:val="0"/>
-          <w:sz w:val="20"/>
-          <w:szCs w:val="20"/>
-          <w14:ligatures w14:val="none"/>
-        </w:rPr>
-      </w:pPr>
-      <w:r>
-        <w:rPr>
-          <w:rFonts w:ascii="Times New Roman" w:eastAsia="Calibri Light" w:hAnsi="Times New Roman" w:cs="Times New Roman"/>
-          <w:kern w:val="0"/>
-          <w:sz w:val="20"/>
-          <w:szCs w:val="20"/>
-          <w14:ligatures w14:val="none"/>
-        </w:rPr>
-        <w:t>Calculated break-even point, target profit, and margin of safety</w:t>
-      </w:r>
-    </w:p>
-    <w:p>
-      <w:pPr>
-        <w:widowControl w:val="0"/>
-        <w:numPr>
-          <w:ilvl w:val="0"/>
-          <w:numId w:val="5"/>
-        </w:numPr>
+        <w:rPr>
+          <w:rFonts w:ascii="Times New Roman" w:hAnsi="Times New Roman" w:cs="Times New Roman"/>
+          <w:bCs/>
+          <w:color w:val="000000"/>
+          <w:sz w:val="20"/>
+          <w:szCs w:val="20"/>
+        </w:rPr>
+      </w:pPr>
+      <w:r>
+        <w:rPr>
+          <w:rFonts w:ascii="Times New Roman" w:hAnsi="Times New Roman" w:cs="Times New Roman"/>
+          <w:bCs/>
+          <w:color w:val="000000"/>
+          <w:sz w:val="20"/>
+          <w:szCs w:val="20"/>
+        </w:rPr>
+        <w:t>Student Member of the Pennsylvania Institute of CPAs and the Institute of Internal Auditors</w:t>
+      </w:r>
+      <w:r>
+        <w:rPr>
+          <w:rFonts w:ascii="Times New Roman" w:hAnsi="Times New Roman" w:cs="Times New Roman"/>
+          <w:bCs/>
+          <w:color w:val="000000"/>
+          <w:sz w:val="20"/>
+          <w:szCs w:val="20"/>
+        </w:rPr>
+        <w:tab/>
+        <w:t>February 2025 – Present</w:t>
+      </w:r>
+    </w:p>
+    <w:p>
+      <w:pPr>
         <w:tabs>
-          <w:tab w:val="left" w:pos="8190"/>
+          <w:tab w:val="left" w:pos="8910"/>
         </w:tabs>
-        <w:autoSpaceDE w:val="0"/>
-        <w:autoSpaceDN w:val="0"/>
-        <w:spacing w:line="360" w:lineRule="auto"/>
-        <w:ind w:left="270" w:hanging="270"/>
-        <w:contextualSpacing/>
-        <w:rPr>
-          <w:rFonts w:ascii="Times New Roman" w:eastAsia="Calibri Light" w:hAnsi="Times New Roman" w:cs="Times New Roman"/>
+        <w:spacing w:line="276" w:lineRule="auto"/>
+        <w:rPr>
+          <w:rFonts w:ascii="Times New Roman" w:hAnsi="Times New Roman" w:cs="Times New Roman"/>
           <w:bCs/>
-          <w:kern w:val="0"/>
-          <w:sz w:val="20"/>
-          <w:szCs w:val="20"/>
-          <w14:ligatures w14:val="none"/>
-        </w:rPr>
-      </w:pPr>
-      <w:r>
-        <w:rPr>
-          <w:rFonts w:ascii="Times New Roman" w:eastAsia="Calibri Light" w:hAnsi="Times New Roman" w:cs="Times New Roman"/>
-          <w:kern w:val="0"/>
-          <w:sz w:val="20"/>
-          <w:szCs w:val="20"/>
-          <w14:ligatures w14:val="none"/>
-        </w:rPr>
-        <w:t>Compared expected results to results from modified situations to make judgments</w:t>
-      </w:r>
+          <w:color w:val="000000"/>
+          <w:sz w:val="20"/>
+          <w:szCs w:val="20"/>
+        </w:rPr>
+      </w:pPr>
+      <w:r>
+        <w:rPr>
+          <w:rFonts w:ascii="Times New Roman" w:hAnsi="Times New Roman" w:cs="Times New Roman"/>
+          <w:bCs/>
+          <w:color w:val="000000"/>
+          <w:sz w:val="20"/>
+          <w:szCs w:val="20"/>
+        </w:rPr>
+        <w:t>Treasurer of Point Park’s Student Accounting Association</w:t>
+      </w:r>
+      <w:r>
+        <w:rPr>
+          <w:rFonts w:ascii="Times New Roman" w:hAnsi="Times New Roman" w:cs="Times New Roman"/>
+          <w:bCs/>
+          <w:color w:val="000000"/>
+          <w:sz w:val="20"/>
+          <w:szCs w:val="20"/>
+        </w:rPr>
+        <w:tab/>
+        <w:t>May 2025 – May 2026</w:t>
+      </w:r>
+    </w:p>
+    <w:p>
+      <w:pPr>
+        <w:tabs>
+          <w:tab w:val="left" w:pos="8820"/>
+        </w:tabs>
+        <w:spacing w:line="276" w:lineRule="auto"/>
+        <w:rPr>
+          <w:rFonts w:ascii="Times New Roman" w:hAnsi="Times New Roman" w:cs="Times New Roman"/>
+          <w:bCs/>
+          <w:color w:val="000000"/>
+          <w:sz w:val="20"/>
+          <w:szCs w:val="20"/>
+        </w:rPr>
+      </w:pPr>
     </w:p>
     <w:p>
       <w:pPr>
@@ -1428,293 +1721,6 @@
         <w:spacing w:line="360" w:lineRule="auto"/>
         <w:rPr>
           <w:rFonts w:ascii="Times New Roman" w:eastAsia="Calibri Light" w:hAnsi="Times New Roman" w:cs="Times New Roman"/>
-          <w:bCs/>
-          <w:color w:val="000000"/>
-          <w:kern w:val="0"/>
-          <w:sz w:val="20"/>
-          <w:szCs w:val="20"/>
-          <w14:ligatures w14:val="none"/>
-        </w:rPr>
-      </w:pPr>
-    </w:p>
-    <w:p>
-      <w:pPr>
-        <w:widowControl w:val="0"/>
-        <w:autoSpaceDE w:val="0"/>
-        <w:autoSpaceDN w:val="0"/>
-        <w:spacing w:line="360" w:lineRule="auto"/>
-        <w:rPr>
-          <w:rFonts w:ascii="Times New Roman" w:eastAsia="Calibri Light" w:hAnsi="Times New Roman" w:cs="Times New Roman"/>
-          <w:b/>
-          <w:color w:val="4472C4"/>
-          <w:kern w:val="0"/>
-          <w:sz w:val="20"/>
-          <w:szCs w:val="20"/>
-          <w14:ligatures w14:val="none"/>
-        </w:rPr>
-      </w:pPr>
-      <w:r>
-        <w:rPr>
-          <w:rFonts w:ascii="Times New Roman" w:eastAsia="Calibri Light" w:hAnsi="Times New Roman" w:cs="Times New Roman"/>
-          <w:b/>
-          <w:color w:val="4472C4"/>
-          <w:kern w:val="0"/>
-          <w:sz w:val="20"/>
-          <w:szCs w:val="20"/>
-          <w14:ligatures w14:val="none"/>
-        </w:rPr>
-        <w:t>ORGANIZATIONS</w:t>
-      </w:r>
-    </w:p>
-    <w:p>
-      <w:pPr>
-        <w:widowControl w:val="0"/>
-        <w:tabs>
-          <w:tab w:val="left" w:pos="8820"/>
-        </w:tabs>
-        <w:autoSpaceDE w:val="0"/>
-        <w:autoSpaceDN w:val="0"/>
-        <w:spacing w:line="276" w:lineRule="auto"/>
-        <w:rPr>
-          <w:rFonts w:ascii="Times New Roman" w:eastAsia="Calibri Light" w:hAnsi="Times New Roman" w:cs="Times New Roman"/>
-          <w:bCs/>
-          <w:color w:val="000000"/>
-          <w:kern w:val="0"/>
-          <w:sz w:val="20"/>
-          <w:szCs w:val="20"/>
-          <w14:ligatures w14:val="none"/>
-        </w:rPr>
-      </w:pPr>
-      <w:r>
-        <w:rPr>
-          <w:rFonts w:ascii="Times New Roman" w:eastAsia="Calibri Light" w:hAnsi="Times New Roman" w:cs="Times New Roman"/>
-          <w:bCs/>
-          <w:color w:val="000000"/>
-          <w:kern w:val="0"/>
-          <w:sz w:val="20"/>
-          <w:szCs w:val="20"/>
-          <w14:ligatures w14:val="none"/>
-        </w:rPr>
-        <w:t xml:space="preserve">Student Member of the </w:t>
-      </w:r>
-      <w:r>
-        <w:rPr>
-          <w:rFonts w:ascii="Times New Roman" w:eastAsia="Calibri Light" w:hAnsi="Times New Roman" w:cs="Times New Roman"/>
-          <w:bCs/>
-          <w:color w:val="000000"/>
-          <w:kern w:val="0"/>
-          <w:sz w:val="20"/>
-          <w:szCs w:val="20"/>
-          <w14:ligatures w14:val="none"/>
-        </w:rPr>
-        <w:t>Pennsylvania Institute of CPAs</w:t>
-      </w:r>
-      <w:r>
-        <w:rPr>
-          <w:rFonts w:ascii="Times New Roman" w:eastAsia="Calibri Light" w:hAnsi="Times New Roman" w:cs="Times New Roman"/>
-          <w:bCs/>
-          <w:color w:val="000000"/>
-          <w:kern w:val="0"/>
-          <w:sz w:val="20"/>
-          <w:szCs w:val="20"/>
-          <w14:ligatures w14:val="none"/>
-        </w:rPr>
-        <w:t xml:space="preserve"> and the Institute of Internal Auditors</w:t>
-      </w:r>
-      <w:r>
-        <w:rPr>
-          <w:rFonts w:ascii="Times New Roman" w:eastAsia="Calibri Light" w:hAnsi="Times New Roman" w:cs="Times New Roman"/>
-          <w:bCs/>
-          <w:color w:val="000000"/>
-          <w:kern w:val="0"/>
-          <w:sz w:val="20"/>
-          <w:szCs w:val="20"/>
-          <w14:ligatures w14:val="none"/>
-        </w:rPr>
-        <w:tab/>
-      </w:r>
-      <w:r>
-        <w:rPr>
-          <w:rFonts w:ascii="Times New Roman" w:eastAsia="Calibri Light" w:hAnsi="Times New Roman" w:cs="Times New Roman"/>
-          <w:bCs/>
-          <w:color w:val="000000"/>
-          <w:kern w:val="0"/>
-          <w:sz w:val="20"/>
-          <w:szCs w:val="20"/>
-          <w14:ligatures w14:val="none"/>
-        </w:rPr>
-        <w:t>February</w:t>
-      </w:r>
-      <w:r>
-        <w:rPr>
-          <w:rFonts w:ascii="Times New Roman" w:eastAsia="Calibri Light" w:hAnsi="Times New Roman" w:cs="Times New Roman"/>
-          <w:bCs/>
-          <w:color w:val="000000"/>
-          <w:kern w:val="0"/>
-          <w:sz w:val="20"/>
-          <w:szCs w:val="20"/>
-          <w14:ligatures w14:val="none"/>
-        </w:rPr>
-        <w:t xml:space="preserve"> </w:t>
-      </w:r>
-      <w:r>
-        <w:rPr>
-          <w:rFonts w:ascii="Times New Roman" w:eastAsia="Calibri Light" w:hAnsi="Times New Roman" w:cs="Times New Roman"/>
-          <w:bCs/>
-          <w:color w:val="000000"/>
-          <w:kern w:val="0"/>
-          <w:sz w:val="20"/>
-          <w:szCs w:val="20"/>
-          <w14:ligatures w14:val="none"/>
-        </w:rPr>
-        <w:t>2025</w:t>
-      </w:r>
-      <w:r>
-        <w:rPr>
-          <w:rFonts w:ascii="Times New Roman" w:eastAsia="Calibri Light" w:hAnsi="Times New Roman" w:cs="Times New Roman"/>
-          <w:bCs/>
-          <w:color w:val="000000"/>
-          <w:kern w:val="0"/>
-          <w:sz w:val="20"/>
-          <w:szCs w:val="20"/>
-          <w14:ligatures w14:val="none"/>
-        </w:rPr>
-        <w:t xml:space="preserve"> </w:t>
-      </w:r>
-      <w:r>
-        <w:rPr>
-          <w:rFonts w:ascii="Times New Roman" w:eastAsia="Calibri Light" w:hAnsi="Times New Roman" w:cs="Times New Roman"/>
-          <w:bCs/>
-          <w:color w:val="000000"/>
-          <w:kern w:val="0"/>
-          <w:sz w:val="20"/>
-          <w:szCs w:val="20"/>
-          <w14:ligatures w14:val="none"/>
-        </w:rPr>
-        <w:t>–</w:t>
-      </w:r>
-      <w:r>
-        <w:rPr>
-          <w:rFonts w:ascii="Times New Roman" w:eastAsia="Calibri Light" w:hAnsi="Times New Roman" w:cs="Times New Roman"/>
-          <w:bCs/>
-          <w:color w:val="000000"/>
-          <w:kern w:val="0"/>
-          <w:sz w:val="20"/>
-          <w:szCs w:val="20"/>
-          <w14:ligatures w14:val="none"/>
-        </w:rPr>
-        <w:t xml:space="preserve"> Present</w:t>
-      </w:r>
-    </w:p>
-    <w:p>
-      <w:pPr>
-        <w:widowControl w:val="0"/>
-        <w:tabs>
-          <w:tab w:val="left" w:pos="8910"/>
-        </w:tabs>
-        <w:autoSpaceDE w:val="0"/>
-        <w:autoSpaceDN w:val="0"/>
-        <w:spacing w:line="276" w:lineRule="auto"/>
-        <w:rPr>
-          <w:rFonts w:ascii="Times New Roman" w:eastAsia="Calibri Light" w:hAnsi="Times New Roman" w:cs="Times New Roman"/>
-          <w:bCs/>
-          <w:color w:val="000000"/>
-          <w:kern w:val="0"/>
-          <w:sz w:val="20"/>
-          <w:szCs w:val="20"/>
-          <w14:ligatures w14:val="none"/>
-        </w:rPr>
-      </w:pPr>
-      <w:r>
-        <w:rPr>
-          <w:rFonts w:ascii="Times New Roman" w:eastAsia="Calibri Light" w:hAnsi="Times New Roman" w:cs="Times New Roman"/>
-          <w:bCs/>
-          <w:color w:val="000000"/>
-          <w:kern w:val="0"/>
-          <w:sz w:val="20"/>
-          <w:szCs w:val="20"/>
-          <w14:ligatures w14:val="none"/>
-        </w:rPr>
-        <w:t xml:space="preserve">Member of </w:t>
-      </w:r>
-      <w:r>
-        <w:rPr>
-          <w:rFonts w:ascii="Times New Roman" w:eastAsia="Calibri Light" w:hAnsi="Times New Roman" w:cs="Times New Roman"/>
-          <w:bCs/>
-          <w:color w:val="000000"/>
-          <w:kern w:val="0"/>
-          <w:sz w:val="20"/>
-          <w:szCs w:val="20"/>
-          <w14:ligatures w14:val="none"/>
-        </w:rPr>
-        <w:t xml:space="preserve">Point Park’s </w:t>
-      </w:r>
-      <w:r>
-        <w:rPr>
-          <w:rFonts w:ascii="Times New Roman" w:eastAsia="Calibri Light" w:hAnsi="Times New Roman" w:cs="Times New Roman"/>
-          <w:bCs/>
-          <w:color w:val="000000"/>
-          <w:kern w:val="0"/>
-          <w:sz w:val="20"/>
-          <w:szCs w:val="20"/>
-          <w14:ligatures w14:val="none"/>
-        </w:rPr>
-        <w:t>Student Accounting Association</w:t>
-      </w:r>
-      <w:r>
-        <w:rPr>
-          <w:rFonts w:ascii="Times New Roman" w:eastAsia="Calibri Light" w:hAnsi="Times New Roman" w:cs="Times New Roman"/>
-          <w:bCs/>
-          <w:color w:val="000000"/>
-          <w:kern w:val="0"/>
-          <w:sz w:val="20"/>
-          <w:szCs w:val="20"/>
-          <w14:ligatures w14:val="none"/>
-        </w:rPr>
-        <w:tab/>
-        <w:t xml:space="preserve">January 2024 – </w:t>
-      </w:r>
-      <w:r>
-        <w:rPr>
-          <w:rFonts w:ascii="Times New Roman" w:eastAsia="Calibri Light" w:hAnsi="Times New Roman" w:cs="Times New Roman"/>
-          <w:bCs/>
-          <w:color w:val="000000"/>
-          <w:kern w:val="0"/>
-          <w:sz w:val="20"/>
-          <w:szCs w:val="20"/>
-          <w14:ligatures w14:val="none"/>
-        </w:rPr>
-        <w:t>Present</w:t>
-      </w:r>
-    </w:p>
-    <w:p>
-      <w:pPr>
-        <w:widowControl w:val="0"/>
-        <w:tabs>
-          <w:tab w:val="left" w:pos="8910"/>
-        </w:tabs>
-        <w:autoSpaceDE w:val="0"/>
-        <w:autoSpaceDN w:val="0"/>
-        <w:spacing w:line="360" w:lineRule="auto"/>
-        <w:rPr>
-          <w:rFonts w:ascii="Times New Roman" w:eastAsia="Calibri Light" w:hAnsi="Times New Roman" w:cs="Times New Roman"/>
-          <w:bCs/>
-          <w:color w:val="000000"/>
-          <w:kern w:val="0"/>
-          <w:sz w:val="20"/>
-          <w:szCs w:val="20"/>
-          <w14:ligatures w14:val="none"/>
-        </w:rPr>
-      </w:pPr>
-    </w:p>
-    <w:p>
-      <w:pPr>
-        <w:widowControl w:val="0"/>
-        <w:autoSpaceDE w:val="0"/>
-        <w:autoSpaceDN w:val="0"/>
-        <w:spacing w:line="360" w:lineRule="auto"/>
-        <w:rPr>
-          <w:rFonts w:ascii="Times New Roman" w:eastAsia="Calibri Light" w:hAnsi="Times New Roman" w:cs="Times New Roman"/>
           <w:color w:val="4472C4"/>
           <w:kern w:val="0"/>
           <w:sz w:val="20"/>
@@ -1843,17 +1849,6 @@
           <w14:ligatures w14:val="none"/>
         </w:rPr>
         <w:t xml:space="preserve"> PostgreSQL</w:t>
-      </w:r>
-      <w:r>
-        <w:rPr>
-          <w:rFonts w:ascii="Times New Roman" w:eastAsia="Calibri Light" w:hAnsi="Times New Roman" w:cs="Times New Roman"/>
-          <w:color w:val="000000"/>
-          <w:kern w:val="0"/>
-          <w:sz w:val="20"/>
-          <w:szCs w:val="20"/>
-          <w14:ligatures w14:val="none"/>
-        </w:rPr>
-        <w:t>, Azure DevOps</w:t>
       </w:r>
     </w:p>
     <w:p>
@@ -1905,7 +1900,7 @@
 </file>
 
 <file path=word/numbering.xml><?xml version="1.0" encoding="utf-8"?>
-<w:numbering xmlns:wpc="http://schemas.microsoft.com/office/word/2010/wordprocessingCanvas" xmlns:cx="http://schemas.microsoft.com/office/drawing/2014/chartex" xmlns:cx1="http://schemas.microsoft.com/office/drawing/2015/9/8/chartex" xmlns:cx2="http://schemas.microsoft.com/office/drawing/2015/10/21/chartex" xmlns:cx3="http://schemas.microsoft.com/office/drawing/2016/5/9/chartex" xmlns:cx4="http://schemas.microsoft.com/office/drawing/2016/5/10/chartex" xmlns:cx5="http://schemas.microsoft.com/office/drawing/2016/5/11/chartex" xmlns:cx6="http://schemas.microsoft.com/office/drawing/2016/5/12/chartex" xmlns:cx7="http://schemas.microsoft.com/office/drawing/2016/5/13/chartex" xmlns:cx8="http://schemas.microsoft.com/office/drawing/2016/5/14/chartex" xmlns:mc="http://schemas.openxmlformats.org/markup-compatibility/2006" xmlns:aink="http://schemas.microsoft.com/office/drawing/2016/ink" xmlns:am3d="http://schemas.microsoft.com/office/drawing/2017/model3d" xmlns:o="urn:schemas-microsoft-com:office:office" xmlns:oel="http://schemas.microsoft.com/office/2019/extlst" xmlns:r="http://schemas.openxmlformats.org/officeDocument/2006/relationships" xmlns:m="http://schemas.openxmlformats.org/officeDocument/2006/math" xmlns:v="urn:schemas-microsoft-com:vml" xmlns:wp14="http://schemas.microsoft.com/office/word/2010/wordprocessingDrawing" xmlns:wp="http://schemas.openxmlformats.org/drawingml/2006/wordprocessingDrawing" xmlns:w10="urn:schemas-microsoft-com:office:word" xmlns:w="http://schemas.openxmlformats.org/wordprocessingml/2006/main" xmlns:w14="http://schemas.microsoft.com/office/word/2010/wordml" xmlns:w15="http://schemas.microsoft.com/office/word/2012/wordml" xmlns:w16cex="http://schemas.microsoft.com/office/word/2018/wordml/cex" xmlns:w16cid="http://schemas.microsoft.com/office/word/2016/wordml/cid" xmlns:w16="http://schemas.microsoft.com/office/word/2018/wordml" xmlns:w16du="http://schemas.microsoft.com/office/word/2023/wordml/word16du" xmlns:w16sdtdh="http://schemas.microsoft.com/office/word/2020/wordml/sdtdatahash" xmlns:w16sdtfl="http://schemas.microsoft.com/office/word/2024/wordml/sdtformatlock" xmlns:w16se="http://schemas.microsoft.com/office/word/2015/wordml/symex" xmlns:wpg="http://schemas.microsoft.com/office/word/2010/wordprocessingGroup" xmlns:wpi="http://schemas.microsoft.com/office/word/2010/wordprocessingInk" xmlns:wne="http://schemas.microsoft.com/office/word/2006/wordml" xmlns:wps="http://schemas.microsoft.com/office/word/2010/wordprocessingShape" mc:Ignorable="w14 w15 w16se w16cid w16 w16cex w16sdtdh w16sdtfl w16du wp14">
+<w:numbering xmlns:wpc="http://schemas.microsoft.com/office/word/2010/wordprocessingCanvas" xmlns:cx="http://schemas.microsoft.com/office/drawing/2014/chartex" xmlns:cx1="http://schemas.microsoft.com/office/drawing/2015/9/8/chartex" xmlns:cx2="http://schemas.microsoft.com/office/drawing/2015/10/21/chartex" xmlns:cx3="http://schemas.microsoft.com/office/drawing/2016/5/9/chartex" xmlns:cx4="http://schemas.microsoft.com/office/drawing/2016/5/10/chartex" xmlns:cx5="http://schemas.microsoft.com/office/drawing/2016/5/11/chartex" xmlns:cx6="http://schemas.microsoft.com/office/drawing/2016/5/12/chartex" xmlns:cx7="http://schemas.microsoft.com/office/drawing/2016/5/13/chartex" xmlns:cx8="http://schemas.microsoft.com/office/drawing/2016/5/14/chartex" xmlns:mc="http://schemas.openxmlformats.org/markup-compatibility/2006" xmlns:m="http://schemas.openxmlformats.org/officeDocument/2006/math" xmlns:aink="http://schemas.microsoft.com/office/drawing/2016/ink" xmlns:am3d="http://schemas.microsoft.com/office/drawing/2017/model3d" xmlns:oel="http://schemas.microsoft.com/office/2019/extlst" xmlns:r="http://schemas.openxmlformats.org/officeDocument/2006/relationships" xmlns:wp14="http://schemas.microsoft.com/office/word/2010/wordprocessingDrawing" xmlns:wp="http://schemas.openxmlformats.org/drawingml/2006/wordprocessingDrawing" xmlns:wpg="http://schemas.microsoft.com/office/word/2010/wordprocessingGroup" xmlns:wpi="http://schemas.microsoft.com/office/word/2010/wordprocessingInk" xmlns:wps="http://schemas.microsoft.com/office/word/2010/wordprocessingShape" xmlns:o="urn:schemas-microsoft-com:office:office" xmlns:v="urn:schemas-microsoft-com:vml" xmlns:w10="urn:schemas-microsoft-com:office:word" xmlns:w="http://schemas.openxmlformats.org/wordprocessingml/2006/main" xmlns:w14="http://schemas.microsoft.com/office/word/2010/wordml" xmlns:w15="http://schemas.microsoft.com/office/word/2012/wordml" xmlns:w16cex="http://schemas.microsoft.com/office/word/2018/wordml/cex" xmlns:w16cid="http://schemas.microsoft.com/office/word/2016/wordml/cid" xmlns:w16="http://schemas.microsoft.com/office/word/2018/wordml" xmlns:w16sdtdh="http://schemas.microsoft.com/office/word/2020/wordml/sdtdatahash" xmlns:w16sdtfl="http://schemas.microsoft.com/office/word/2024/wordml/sdtformatlock" xmlns:w16se="http://schemas.microsoft.com/office/word/2015/wordml/symex" xmlns:w16du="http://schemas.microsoft.com/office/word/2023/wordml/word16du" xmlns:wne="http://schemas.microsoft.com/office/word/2006/wordml" mc:Ignorable="w14 w15 w16se w16cid w16 w16cex w16sdtdh w16sdtfl w16du wp14">
   <w:abstractNum w:abstractNumId="0" w15:restartNumberingAfterBreak="0">
     <w:nsid w:val="0A906730"/>
     <w:multiLevelType w:val="hybridMultilevel"/>
@@ -2020,6 +2015,119 @@
     </w:lvl>
   </w:abstractNum>
   <w:abstractNum w:abstractNumId="1" w15:restartNumberingAfterBreak="0">
+    <w:nsid w:val="12BB41BC"/>
+    <w:multiLevelType w:val="hybridMultilevel"/>
+    <w:tmpl w:val="60366F2E"/>
+    <w:lvl w:ilvl="0" w:tplc="04090001">
+      <w:start w:val="1"/>
+      <w:numFmt w:val="bullet"/>
+      <w:lvlText w:val=""/>
+      <w:lvlJc w:val="left"/>
+      <w:pPr>
+        <w:ind w:left="810" w:hanging="360"/>
+      </w:pPr>
+      <w:rPr>
+        <w:rFonts w:ascii="Symbol" w:hAnsi="Symbol" w:hint="default"/>
+      </w:rPr>
+    </w:lvl>
+    <w:lvl w:ilvl="1" w:tplc="FFFFFFFF">
+      <w:start w:val="1"/>
+      <w:numFmt w:val="bullet"/>
+      <w:lvlText w:val="o"/>
+      <w:lvlJc w:val="left"/>
+      <w:pPr>
+        <w:ind w:left="1530" w:hanging="360"/>
+      </w:pPr>
+      <w:rPr>
+        <w:rFonts w:ascii="Courier New" w:hAnsi="Courier New" w:cs="Courier New" w:hint="default"/>
+      </w:rPr>
+    </w:lvl>
+    <w:lvl w:ilvl="2" w:tplc="FFFFFFFF" w:tentative="1">
+      <w:start w:val="1"/>
+      <w:numFmt w:val="bullet"/>
+      <w:lvlText w:val=""/>
+      <w:lvlJc w:val="left"/>
+      <w:pPr>
+        <w:ind w:left="2250" w:hanging="360"/>
+      </w:pPr>
+      <w:rPr>
+        <w:rFonts w:ascii="Wingdings" w:hAnsi="Wingdings" w:hint="default"/>
+      </w:rPr>
+    </w:lvl>
+    <w:lvl w:ilvl="3" w:tplc="FFFFFFFF" w:tentative="1">
+      <w:start w:val="1"/>
+      <w:numFmt w:val="bullet"/>
+      <w:lvlText w:val=""/>
+      <w:lvlJc w:val="left"/>
+      <w:pPr>
+        <w:ind w:left="2970" w:hanging="360"/>
+      </w:pPr>
+      <w:rPr>
+        <w:rFonts w:ascii="Symbol" w:hAnsi="Symbol" w:hint="default"/>
+      </w:rPr>
+    </w:lvl>
+    <w:lvl w:ilvl="4" w:tplc="FFFFFFFF" w:tentative="1">
+      <w:start w:val="1"/>
+      <w:numFmt w:val="bullet"/>
+      <w:lvlText w:val="o"/>
+      <w:lvlJc w:val="left"/>
+      <w:pPr>
+        <w:ind w:left="3690" w:hanging="360"/>
+      </w:pPr>
+      <w:rPr>
+        <w:rFonts w:ascii="Courier New" w:hAnsi="Courier New" w:cs="Courier New" w:hint="default"/>
+      </w:rPr>
+    </w:lvl>
+    <w:lvl w:ilvl="5" w:tplc="FFFFFFFF" w:tentative="1">
+      <w:start w:val="1"/>
+      <w:numFmt w:val="bullet"/>
+      <w:lvlText w:val=""/>
+      <w:lvlJc w:val="left"/>
+      <w:pPr>
+        <w:ind w:left="4410" w:hanging="360"/>
+      </w:pPr>
+      <w:rPr>
+        <w:rFonts w:ascii="Wingdings" w:hAnsi="Wingdings" w:hint="default"/>
+      </w:rPr>
+    </w:lvl>
+    <w:lvl w:ilvl="6" w:tplc="FFFFFFFF" w:tentative="1">
+      <w:start w:val="1"/>
+      <w:numFmt w:val="bullet"/>
+      <w:lvlText w:val=""/>
+      <w:lvlJc w:val="left"/>
+      <w:pPr>
+        <w:ind w:left="5130" w:hanging="360"/>
+      </w:pPr>
+      <w:rPr>
+        <w:rFonts w:ascii="Symbol" w:hAnsi="Symbol" w:hint="default"/>
+      </w:rPr>
+    </w:lvl>
+    <w:lvl w:ilvl="7" w:tplc="FFFFFFFF" w:tentative="1">
+      <w:start w:val="1"/>
+      <w:numFmt w:val="bullet"/>
+      <w:lvlText w:val="o"/>
+      <w:lvlJc w:val="left"/>
+      <w:pPr>
+        <w:ind w:left="5850" w:hanging="360"/>
+      </w:pPr>
+      <w:rPr>
+        <w:rFonts w:ascii="Courier New" w:hAnsi="Courier New" w:cs="Courier New" w:hint="default"/>
+      </w:rPr>
+    </w:lvl>
+    <w:lvl w:ilvl="8" w:tplc="FFFFFFFF" w:tentative="1">
+      <w:start w:val="1"/>
+      <w:numFmt w:val="bullet"/>
+      <w:lvlText w:val=""/>
+      <w:lvlJc w:val="left"/>
+      <w:pPr>
+        <w:ind w:left="6570" w:hanging="360"/>
+      </w:pPr>
+      <w:rPr>
+        <w:rFonts w:ascii="Wingdings" w:hAnsi="Wingdings" w:hint="default"/>
+      </w:rPr>
+    </w:lvl>
+  </w:abstractNum>
+  <w:abstractNum w:abstractNumId="2" w15:restartNumberingAfterBreak="0">
     <w:nsid w:val="1CEF260F"/>
     <w:multiLevelType w:val="hybridMultilevel"/>
     <w:tmpl w:val="86B438D6"/>
@@ -2132,7 +2240,7 @@
       </w:rPr>
     </w:lvl>
   </w:abstractNum>
-  <w:abstractNum w:abstractNumId="2" w15:restartNumberingAfterBreak="0">
+  <w:abstractNum w:abstractNumId="3" w15:restartNumberingAfterBreak="0">
     <w:nsid w:val="253D5711"/>
     <w:multiLevelType w:val="hybridMultilevel"/>
     <w:tmpl w:val="FFA6241C"/>
@@ -2245,7 +2353,7 @@
       </w:rPr>
     </w:lvl>
   </w:abstractNum>
-  <w:abstractNum w:abstractNumId="3" w15:restartNumberingAfterBreak="0">
+  <w:abstractNum w:abstractNumId="4" w15:restartNumberingAfterBreak="0">
     <w:nsid w:val="390701B8"/>
     <w:multiLevelType w:val="hybridMultilevel"/>
     <w:tmpl w:val="175C61A8"/>
@@ -2358,7 +2466,7 @@
       </w:rPr>
     </w:lvl>
   </w:abstractNum>
-  <w:abstractNum w:abstractNumId="4" w15:restartNumberingAfterBreak="0">
+  <w:abstractNum w:abstractNumId="5" w15:restartNumberingAfterBreak="0">
     <w:nsid w:val="512F31FE"/>
     <w:multiLevelType w:val="hybridMultilevel"/>
     <w:tmpl w:val="1CFAF31C"/>
@@ -2472,25 +2580,28 @@
     </w:lvl>
   </w:abstractNum>
   <w:num w:numId="1" w16cid:durableId="287857636">
-    <w:abstractNumId w:val="4"/>
+    <w:abstractNumId w:val="5"/>
   </w:num>
   <w:num w:numId="2" w16cid:durableId="2031450753">
-    <w:abstractNumId w:val="2"/>
+    <w:abstractNumId w:val="3"/>
   </w:num>
   <w:num w:numId="3" w16cid:durableId="1663583691">
     <w:abstractNumId w:val="0"/>
   </w:num>
   <w:num w:numId="4" w16cid:durableId="99374126">
-    <w:abstractNumId w:val="3"/>
+    <w:abstractNumId w:val="4"/>
   </w:num>
   <w:num w:numId="5" w16cid:durableId="820583102">
+    <w:abstractNumId w:val="2"/>
+  </w:num>
+  <w:num w:numId="6" w16cid:durableId="85424380">
     <w:abstractNumId w:val="1"/>
   </w:num>
 </w:numbering>
 </file>
 
 <file path=word/styles.xml><?xml version="1.0" encoding="utf-8"?>
-<w:styles xmlns:mc="http://schemas.openxmlformats.org/markup-compatibility/2006" xmlns:r="http://schemas.openxmlformats.org/officeDocument/2006/relationships" xmlns:w="http://schemas.openxmlformats.org/wordprocessingml/2006/main" xmlns:w14="http://schemas.microsoft.com/office/word/2010/wordml" xmlns:w15="http://schemas.microsoft.com/office/word/2012/wordml" xmlns:w16cex="http://schemas.microsoft.com/office/word/2018/wordml/cex" xmlns:w16cid="http://schemas.microsoft.com/office/word/2016/wordml/cid" xmlns:w16="http://schemas.microsoft.com/office/word/2018/wordml" xmlns:w16du="http://schemas.microsoft.com/office/word/2023/wordml/word16du" xmlns:w16sdtdh="http://schemas.microsoft.com/office/word/2020/wordml/sdtdatahash" xmlns:w16sdtfl="http://schemas.microsoft.com/office/word/2024/wordml/sdtformatlock" xmlns:w16se="http://schemas.microsoft.com/office/word/2015/wordml/symex" mc:Ignorable="w14 w15 w16se w16cid w16 w16cex w16sdtdh w16sdtfl w16du">
+<w:styles xmlns:mc="http://schemas.openxmlformats.org/markup-compatibility/2006" xmlns:r="http://schemas.openxmlformats.org/officeDocument/2006/relationships" xmlns:w="http://schemas.openxmlformats.org/wordprocessingml/2006/main" xmlns:w14="http://schemas.microsoft.com/office/word/2010/wordml" xmlns:w15="http://schemas.microsoft.com/office/word/2012/wordml" xmlns:w16cex="http://schemas.microsoft.com/office/word/2018/wordml/cex" xmlns:w16cid="http://schemas.microsoft.com/office/word/2016/wordml/cid" xmlns:w16="http://schemas.microsoft.com/office/word/2018/wordml" xmlns:w16sdtdh="http://schemas.microsoft.com/office/word/2020/wordml/sdtdatahash" xmlns:w16sdtfl="http://schemas.microsoft.com/office/word/2024/wordml/sdtformatlock" xmlns:w16se="http://schemas.microsoft.com/office/word/2015/wordml/symex" xmlns:w16du="http://schemas.microsoft.com/office/word/2023/wordml/word16du" mc:Ignorable="w14 w15 w16se w16cid w16 w16cex w16sdtdh w16sdtfl w16du">
   <w:docDefaults>
     <w:rPrDefault>
       <w:rPr>
@@ -3424,6 +3535,18 @@
       <w:shd w:val="clear" w:color="auto" w:fill="E1DFDD"/>
     </w:rPr>
   </w:style>
+  <w:style w:type="character" w:styleId="FollowedHyperlink">
+    <w:name w:val="FollowedHyperlink"/>
+    <w:basedOn w:val="DefaultParagraphFont"/>
+    <w:uiPriority w:val="99"/>
+    <w:semiHidden/>
+    <w:unhideWhenUsed/>
+    <w:rsid w:val="00E10D99"/>
+    <w:rPr>
+      <w:color w:val="96607D" w:themeColor="followedHyperlink"/>
+      <w:u w:val="single"/>
+    </w:rPr>
+  </w:style>
 </w:styles>
 </file>
 

</xml_diff>